<commit_message>
tekniseen määrittelyyn kuvat valmiista projektista
</commit_message>
<xml_diff>
--- a/documents/tekninen_maarittely.docx
+++ b/documents/tekninen_maarittely.docx
@@ -1,6 +1,6 @@
 
 <file path=word/document.xml><?xml version="1.0" encoding="utf-8"?>
-<w:document xmlns:wpc="http://schemas.microsoft.com/office/word/2010/wordprocessingCanvas" xmlns:cx="http://schemas.microsoft.com/office/drawing/2014/chartex" xmlns:cx1="http://schemas.microsoft.com/office/drawing/2015/9/8/chartex" xmlns:cx2="http://schemas.microsoft.com/office/drawing/2015/10/21/chartex" xmlns:cx3="http://schemas.microsoft.com/office/drawing/2016/5/9/chartex" xmlns:cx4="http://schemas.microsoft.com/office/drawing/2016/5/10/chartex" xmlns:cx5="http://schemas.microsoft.com/office/drawing/2016/5/11/chartex" xmlns:cx6="http://schemas.microsoft.com/office/drawing/2016/5/12/chartex" xmlns:cx7="http://schemas.microsoft.com/office/drawing/2016/5/13/chartex" xmlns:cx8="http://schemas.microsoft.com/office/drawing/2016/5/14/chartex" xmlns:mc="http://schemas.openxmlformats.org/markup-compatibility/2006" xmlns:aink="http://schemas.microsoft.com/office/drawing/2016/ink" xmlns:am3d="http://schemas.microsoft.com/office/drawing/2017/model3d" xmlns:o="urn:schemas-microsoft-com:office:office" xmlns:oel="http://schemas.microsoft.com/office/2019/extlst" xmlns:r="http://schemas.openxmlformats.org/officeDocument/2006/relationships" xmlns:m="http://schemas.openxmlformats.org/officeDocument/2006/math" xmlns:v="urn:schemas-microsoft-com:vml" xmlns:wp14="http://schemas.microsoft.com/office/word/2010/wordprocessingDrawing" xmlns:wp="http://schemas.openxmlformats.org/drawingml/2006/wordprocessingDrawing" xmlns:w10="urn:schemas-microsoft-com:office:word" xmlns:w="http://schemas.openxmlformats.org/wordprocessingml/2006/main" xmlns:w14="http://schemas.microsoft.com/office/word/2010/wordml" xmlns:w15="http://schemas.microsoft.com/office/word/2012/wordml" xmlns:w16cex="http://schemas.microsoft.com/office/word/2018/wordml/cex" xmlns:w16cid="http://schemas.microsoft.com/office/word/2016/wordml/cid" xmlns:w16="http://schemas.microsoft.com/office/word/2018/wordml" xmlns:w16du="http://schemas.microsoft.com/office/word/2023/wordml/word16du" xmlns:w16sdtdh="http://schemas.microsoft.com/office/word/2020/wordml/sdtdatahash" xmlns:w16sdtfl="http://schemas.microsoft.com/office/word/2024/wordml/sdtformatlock" xmlns:w16se="http://schemas.microsoft.com/office/word/2015/wordml/symex" xmlns:wpg="http://schemas.microsoft.com/office/word/2010/wordprocessingGroup" xmlns:wpi="http://schemas.microsoft.com/office/word/2010/wordprocessingInk" xmlns:wne="http://schemas.microsoft.com/office/word/2006/wordml" xmlns:wps="http://schemas.microsoft.com/office/word/2010/wordprocessingShape" mc:Ignorable="w14 w15 w16se w16cid w16 w16cex w16sdtdh w16sdtfl w16du wp14">
+<w:document xmlns:wpc="http://schemas.microsoft.com/office/word/2010/wordprocessingCanvas" xmlns:cx="http://schemas.microsoft.com/office/drawing/2014/chartex" xmlns:cx1="http://schemas.microsoft.com/office/drawing/2015/9/8/chartex" xmlns:cx2="http://schemas.microsoft.com/office/drawing/2015/10/21/chartex" xmlns:cx3="http://schemas.microsoft.com/office/drawing/2016/5/9/chartex" xmlns:cx4="http://schemas.microsoft.com/office/drawing/2016/5/10/chartex" xmlns:cx5="http://schemas.microsoft.com/office/drawing/2016/5/11/chartex" xmlns:cx6="http://schemas.microsoft.com/office/drawing/2016/5/12/chartex" xmlns:cx7="http://schemas.microsoft.com/office/drawing/2016/5/13/chartex" xmlns:cx8="http://schemas.microsoft.com/office/drawing/2016/5/14/chartex" xmlns:mc="http://schemas.openxmlformats.org/markup-compatibility/2006" xmlns:aink="http://schemas.microsoft.com/office/drawing/2016/ink" xmlns:am3d="http://schemas.microsoft.com/office/drawing/2017/model3d" xmlns:o="urn:schemas-microsoft-com:office:office" xmlns:oel="http://schemas.microsoft.com/office/2019/extlst" xmlns:r="http://schemas.openxmlformats.org/officeDocument/2006/relationships" xmlns:m="http://schemas.openxmlformats.org/officeDocument/2006/math" xmlns:v="urn:schemas-microsoft-com:vml" xmlns:wp14="http://schemas.microsoft.com/office/word/2010/wordprocessingDrawing" xmlns:wp="http://schemas.openxmlformats.org/drawingml/2006/wordprocessingDrawing" xmlns:w10="urn:schemas-microsoft-com:office:word" xmlns:w="http://schemas.openxmlformats.org/wordprocessingml/2006/main" xmlns:w14="http://schemas.microsoft.com/office/word/2010/wordml" xmlns:w15="http://schemas.microsoft.com/office/word/2012/wordml" xmlns:w16cex="http://schemas.microsoft.com/office/word/2018/wordml/cex" xmlns:w16cid="http://schemas.microsoft.com/office/word/2016/wordml/cid" xmlns:w16="http://schemas.microsoft.com/office/word/2018/wordml" xmlns:w16du="http://schemas.microsoft.com/office/word/2023/wordml/word16du" xmlns:w16sdtdh="http://schemas.microsoft.com/office/word/2020/wordml/sdtdatahash" xmlns:w16sdtfl="http://schemas.microsoft.com/office/word/2024/wordml/sdtformatlock" xmlns:w16se="http://schemas.microsoft.com/office/word/2015/wordml/symex" xmlns:wpg="http://schemas.microsoft.com/office/word/2010/wordprocessingGroup" xmlns:wpi="http://schemas.microsoft.com/office/word/2010/wordprocessingInk" xmlns:wne="http://schemas.microsoft.com/office/word/2006/wordml" xmlns:wps="http://schemas.microsoft.com/office/word/2010/wordprocessingShape" xmlns:a="http://schemas.openxmlformats.org/drawingml/2006/main" xmlns:pic="http://schemas.openxmlformats.org/drawingml/2006/picture" xmlns:a14="http://schemas.microsoft.com/office/drawing/2010/main" mc:Ignorable="w14 w15 w16se w16cid w16 w16cex w16sdtdh w16sdtfl w16du wp14">
   <w:body>
     <w:p>
       <w:pPr>
@@ -617,15 +617,14 @@
           <w:szCs w:val="24"/>
         </w:rPr>
       </w:pPr>
-      <w:bookmarkStart w:id="0" w:name="_Toc52249909"/>
-      <w:bookmarkStart w:id="1" w:name="_Toc62403102"/>
+      <w:bookmarkStart w:name="_Toc52249909" w:id="0"/>
+      <w:bookmarkStart w:name="_Toc62403102" w:id="1"/>
       <w:r>
         <w:rPr>
           <w:rFonts w:ascii="Verdana" w:hAnsi="Verdana" w:cs="Verdana"/>
           <w:sz w:val="24"/>
           <w:szCs w:val="24"/>
         </w:rPr>
-        <w:lastRenderedPageBreak/>
         <w:t>T</w:t>
       </w:r>
       <w:r>
@@ -920,7 +919,6 @@
           <w:sz w:val="24"/>
           <w:szCs w:val="24"/>
         </w:rPr>
-        <w:lastRenderedPageBreak/>
         <w:t>JÄRJESTELMÄARKKITEHTUURI</w:t>
       </w:r>
     </w:p>
@@ -960,7 +958,7 @@
         </w:rPr>
         <w:t xml:space="preserve"> </w:t>
       </w:r>
-      <w:bookmarkStart w:id="2" w:name="_Hlk62126912"/>
+      <w:bookmarkStart w:name="_Hlk62126912" w:id="2"/>
       <w:r>
         <w:rPr>
           <w:rFonts w:ascii="Verdana" w:hAnsi="Verdana" w:cs="Verdana"/>
@@ -1232,8 +1230,8 @@
                   </w:drawing>
                 </mc:Choice>
                 <mc:Fallback>
-                  <w:pict>
-                    <v:rect w14:anchorId="18F5E199" id="Suorakulmio 5" o:spid="_x0000_s1026" style="position:absolute;left:0;text-align:left;margin-left:-5.35pt;margin-top:-.05pt;width:484.2pt;height:4in;z-index:251660288;visibility:visible;mso-wrap-style:square;mso-width-percent:0;mso-height-percent:0;mso-wrap-distance-left:9pt;mso-wrap-distance-top:0;mso-wrap-distance-right:9pt;mso-wrap-distance-bottom:0;mso-position-horizontal:absolute;mso-position-horizontal-relative:text;mso-position-vertical:absolute;mso-position-vertical-relative:text;mso-width-percent:0;mso-height-percent:0;mso-width-relative:margin;mso-height-relative:margin;v-text-anchor:middle" o:gfxdata="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" fillcolor="white [3212]" strokecolor="#091723 [484]" strokeweight="1pt">
+                  <w:pict w14:anchorId="2EBFF27B">
+                    <v:rect id="Suorakulmio 5" style="position:absolute;left:0;text-align:left;margin-left:-5.35pt;margin-top:-.05pt;width:484.2pt;height:4in;z-index:251660288;visibility:visible;mso-wrap-style:square;mso-width-percent:0;mso-height-percent:0;mso-wrap-distance-left:9pt;mso-wrap-distance-top:0;mso-wrap-distance-right:9pt;mso-wrap-distance-bottom:0;mso-position-horizontal:absolute;mso-position-horizontal-relative:text;mso-position-vertical:absolute;mso-position-vertical-relative:text;mso-width-percent:0;mso-height-percent:0;mso-width-relative:margin;mso-height-relative:margin;v-text-anchor:middle" o:spid="_x0000_s1026" fillcolor="white [3212]" strokecolor="#091723 [484]" strokeweight="1pt" w14:anchorId="18F5E199" o:gfxdata="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">
                       <v:textbox>
                         <w:txbxContent>
                           <w:p>
@@ -1250,10 +1248,10 @@
                                 <w:lang w:eastAsia="fi-FI"/>
                               </w:rPr>
                               <w:drawing>
-                                <wp:inline distT="0" distB="0" distL="0" distR="0" wp14:anchorId="4F68F645" wp14:editId="1456E7D0">
+                                <wp:inline distT="0" distB="0" distL="0" distR="0" wp14:anchorId="20158CD8" wp14:editId="1456E7D0">
                                   <wp:extent cx="5953760" cy="2515870"/>
                                   <wp:effectExtent l="0" t="0" r="8890" b="0"/>
-                                  <wp:docPr id="1115189765" name="Kuva 2"/>
+                                  <wp:docPr id="638929532" name="Kuva 2"/>
                                   <wp:cNvGraphicFramePr>
                                     <a:graphicFrameLocks xmlns:a="http://schemas.openxmlformats.org/drawingml/2006/main" noChangeAspect="1"/>
                                   </wp:cNvGraphicFramePr>
@@ -1602,7 +1600,6 @@
         <w:rPr>
           <w:rFonts w:ascii="Verdana" w:hAnsi="Verdana"/>
         </w:rPr>
-        <w:lastRenderedPageBreak/>
         <w:t xml:space="preserve">toiminnallisuuksia ajonaikaisesti ladattavia kirjastokomponentteja (DLL-komponentit). Nämä </w:t>
       </w:r>
       <w:r>
@@ -1677,7 +1674,7 @@
         </w:rPr>
         <w:t xml:space="preserve"> tapahtumapohjaista sovelluskehitystä. </w:t>
       </w:r>
-      <w:bookmarkStart w:id="3" w:name="_Hlk61797887"/>
+      <w:bookmarkStart w:name="_Hlk61797887" w:id="3"/>
     </w:p>
     <w:p>
       <w:pPr>
@@ -1946,7 +1943,7 @@
         </w:rPr>
         <w:t xml:space="preserve"> (</w:t>
       </w:r>
-      <w:hyperlink r:id="rId12" w:history="1">
+      <w:hyperlink w:history="1" r:id="rId12">
         <w:r>
           <w:rPr>
             <w:rStyle w:val="Hyperlinkki"/>
@@ -1991,7 +1988,7 @@
         </w:rPr>
         <w:t xml:space="preserve"> RFID-125-KEY (</w:t>
       </w:r>
-      <w:hyperlink r:id="rId13" w:history="1">
+      <w:hyperlink w:history="1" r:id="rId13">
         <w:r>
           <w:rPr>
             <w:rStyle w:val="Hyperlinkki"/>
@@ -2044,14 +2041,13 @@
           <w:szCs w:val="24"/>
         </w:rPr>
       </w:pPr>
-      <w:bookmarkStart w:id="4" w:name="_Toc62403115"/>
+      <w:bookmarkStart w:name="_Toc62403115" w:id="4"/>
       <w:r>
         <w:rPr>
           <w:rFonts w:ascii="Verdana" w:hAnsi="Verdana" w:cs="Verdana"/>
           <w:sz w:val="24"/>
           <w:szCs w:val="24"/>
         </w:rPr>
-        <w:lastRenderedPageBreak/>
         <w:t>KÄYTTÖTAPAU</w:t>
       </w:r>
       <w:bookmarkEnd w:id="4"/>
@@ -2117,12 +2113,12 @@
         <w:tblW w:w="9618" w:type="dxa"/>
         <w:tblInd w:w="-8" w:type="dxa"/>
         <w:tblBorders>
-          <w:top w:val="single" w:sz="6" w:space="0" w:color="000000"/>
-          <w:left w:val="single" w:sz="6" w:space="0" w:color="000000"/>
-          <w:bottom w:val="single" w:sz="6" w:space="0" w:color="000000"/>
-          <w:right w:val="single" w:sz="6" w:space="0" w:color="000000"/>
-          <w:insideH w:val="single" w:sz="6" w:space="0" w:color="000000"/>
-          <w:insideV w:val="single" w:sz="6" w:space="0" w:color="000000"/>
+          <w:top w:val="single" w:color="000000" w:sz="6" w:space="0"/>
+          <w:left w:val="single" w:color="000000" w:sz="6" w:space="0"/>
+          <w:bottom w:val="single" w:color="000000" w:sz="6" w:space="0"/>
+          <w:right w:val="single" w:color="000000" w:sz="6" w:space="0"/>
+          <w:insideH w:val="single" w:color="000000" w:sz="6" w:space="0"/>
+          <w:insideV w:val="single" w:color="000000" w:sz="6" w:space="0"/>
         </w:tblBorders>
         <w:tblLayout w:type="fixed"/>
         <w:tblCellMar>
@@ -2841,8 +2837,8 @@
                   </w:drawing>
                 </mc:Choice>
                 <mc:Fallback>
-                  <w:pict>
-                    <v:rect w14:anchorId="5AD4D5D0" id="Suorakulmio 3" o:spid="_x0000_s1027" style="position:absolute;margin-left:-5.35pt;margin-top:-3.5pt;width:523.2pt;height:324.6pt;z-index:251659264;visibility:visible;mso-wrap-style:square;mso-wrap-distance-left:9pt;mso-wrap-distance-top:0;mso-wrap-distance-right:9pt;mso-wrap-distance-bottom:0;mso-position-horizontal:absolute;mso-position-horizontal-relative:text;mso-position-vertical:absolute;mso-position-vertical-relative:text;v-text-anchor:middle" o:gfxdata="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" fillcolor="white [3212]" strokecolor="#091723 [484]" strokeweight="1pt">
+                  <w:pict w14:anchorId="1EFBC800">
+                    <v:rect id="Suorakulmio 3" style="position:absolute;margin-left:-5.35pt;margin-top:-3.5pt;width:523.2pt;height:324.6pt;z-index:251659264;visibility:visible;mso-wrap-style:square;mso-wrap-distance-left:9pt;mso-wrap-distance-top:0;mso-wrap-distance-right:9pt;mso-wrap-distance-bottom:0;mso-position-horizontal:absolute;mso-position-horizontal-relative:text;mso-position-vertical:absolute;mso-position-vertical-relative:text;v-text-anchor:middle" o:spid="_x0000_s1027" fillcolor="white [3212]" strokecolor="#091723 [484]" strokeweight="1pt" w14:anchorId="5AD4D5D0" o:gfxdata="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">
                       <v:textbox>
                         <w:txbxContent>
                           <w:p>
@@ -2859,10 +2855,10 @@
                                 <w:lang w:eastAsia="fi-FI"/>
                               </w:rPr>
                               <w:drawing>
-                                <wp:inline distT="0" distB="0" distL="0" distR="0" wp14:anchorId="4248723D" wp14:editId="198DAE42">
+                                <wp:inline distT="0" distB="0" distL="0" distR="0" wp14:anchorId="4F07903B" wp14:editId="198DAE42">
                                   <wp:extent cx="6247130" cy="4018280"/>
                                   <wp:effectExtent l="0" t="0" r="1270" b="1270"/>
-                                  <wp:docPr id="1893905770" name="Kuva 4"/>
+                                  <wp:docPr id="1145369396" name="Kuva 4"/>
                                   <wp:cNvGraphicFramePr>
                                     <a:graphicFrameLocks xmlns:a="http://schemas.openxmlformats.org/drawingml/2006/main" noChangeAspect="1"/>
                                   </wp:cNvGraphicFramePr>
@@ -2966,14 +2962,13 @@
         </w:rPr>
         <w:br w:type="page"/>
       </w:r>
-      <w:bookmarkStart w:id="5" w:name="_Toc62403117"/>
+      <w:bookmarkStart w:name="_Toc62403117" w:id="5"/>
       <w:r>
         <w:rPr>
           <w:rFonts w:ascii="Verdana" w:hAnsi="Verdana" w:cs="Verdana"/>
           <w:b/>
           <w:bCs/>
         </w:rPr>
-        <w:lastRenderedPageBreak/>
         <w:t>Käyttötapauskortit</w:t>
       </w:r>
       <w:bookmarkEnd w:id="5"/>
@@ -3033,12 +3028,12 @@
         <w:tblW w:w="9781" w:type="dxa"/>
         <w:tblInd w:w="-5" w:type="dxa"/>
         <w:tblBorders>
-          <w:top w:val="single" w:sz="4" w:space="0" w:color="000000"/>
-          <w:left w:val="single" w:sz="4" w:space="0" w:color="000000"/>
-          <w:bottom w:val="single" w:sz="4" w:space="0" w:color="000000"/>
-          <w:right w:val="single" w:sz="4" w:space="0" w:color="000000"/>
-          <w:insideH w:val="single" w:sz="4" w:space="0" w:color="000000"/>
-          <w:insideV w:val="single" w:sz="4" w:space="0" w:color="000000"/>
+          <w:top w:val="single" w:color="000000" w:sz="4" w:space="0"/>
+          <w:left w:val="single" w:color="000000" w:sz="4" w:space="0"/>
+          <w:bottom w:val="single" w:color="000000" w:sz="4" w:space="0"/>
+          <w:right w:val="single" w:color="000000" w:sz="4" w:space="0"/>
+          <w:insideH w:val="single" w:color="000000" w:sz="4" w:space="0"/>
+          <w:insideV w:val="single" w:color="000000" w:sz="4" w:space="0"/>
         </w:tblBorders>
         <w:tblLook w:val="04A0" w:firstRow="1" w:lastRow="0" w:firstColumn="1" w:lastColumn="0" w:noHBand="0" w:noVBand="1"/>
       </w:tblPr>
@@ -3519,6 +3514,13 @@
                 <w:szCs w:val="20"/>
               </w:rPr>
               <w:br/>
+            </w:r>
+            <w:r>
+              <w:rPr>
+                <w:rFonts w:ascii="Verdana" w:hAnsi="Verdana" w:cs="Verdana"/>
+                <w:sz w:val="20"/>
+                <w:szCs w:val="20"/>
+              </w:rPr>
               <w:t xml:space="preserve">3.1 Jos käyttäjä ei syötä mitään numeroita 10 sekunnin sisällä palataan takaisin </w:t>
             </w:r>
             <w:r>
@@ -3964,12 +3966,12 @@
         <w:tblW w:w="0" w:type="auto"/>
         <w:tblInd w:w="-5" w:type="dxa"/>
         <w:tblBorders>
-          <w:top w:val="single" w:sz="4" w:space="0" w:color="000000"/>
-          <w:left w:val="single" w:sz="4" w:space="0" w:color="000000"/>
-          <w:bottom w:val="single" w:sz="4" w:space="0" w:color="000000"/>
-          <w:right w:val="single" w:sz="4" w:space="0" w:color="000000"/>
-          <w:insideH w:val="single" w:sz="4" w:space="0" w:color="000000"/>
-          <w:insideV w:val="single" w:sz="4" w:space="0" w:color="000000"/>
+          <w:top w:val="single" w:color="000000" w:sz="4" w:space="0"/>
+          <w:left w:val="single" w:color="000000" w:sz="4" w:space="0"/>
+          <w:bottom w:val="single" w:color="000000" w:sz="4" w:space="0"/>
+          <w:right w:val="single" w:color="000000" w:sz="4" w:space="0"/>
+          <w:insideH w:val="single" w:color="000000" w:sz="4" w:space="0"/>
+          <w:insideV w:val="single" w:color="000000" w:sz="4" w:space="0"/>
         </w:tblBorders>
         <w:tblLook w:val="04A0" w:firstRow="1" w:lastRow="0" w:firstColumn="1" w:lastColumn="0" w:noHBand="0" w:noVBand="1"/>
       </w:tblPr>
@@ -4136,7 +4138,6 @@
                 <w:sz w:val="20"/>
                 <w:szCs w:val="20"/>
               </w:rPr>
-              <w:lastRenderedPageBreak/>
               <w:t>Tavoite</w:t>
             </w:r>
           </w:p>
@@ -4639,12 +4640,12 @@
         <w:tblW w:w="0" w:type="auto"/>
         <w:tblInd w:w="-95" w:type="dxa"/>
         <w:tblBorders>
-          <w:top w:val="single" w:sz="4" w:space="0" w:color="000000"/>
-          <w:left w:val="single" w:sz="4" w:space="0" w:color="000000"/>
-          <w:bottom w:val="single" w:sz="4" w:space="0" w:color="000000"/>
-          <w:right w:val="single" w:sz="4" w:space="0" w:color="000000"/>
-          <w:insideH w:val="single" w:sz="4" w:space="0" w:color="000000"/>
-          <w:insideV w:val="single" w:sz="4" w:space="0" w:color="000000"/>
+          <w:top w:val="single" w:color="000000" w:sz="4" w:space="0"/>
+          <w:left w:val="single" w:color="000000" w:sz="4" w:space="0"/>
+          <w:bottom w:val="single" w:color="000000" w:sz="4" w:space="0"/>
+          <w:right w:val="single" w:color="000000" w:sz="4" w:space="0"/>
+          <w:insideH w:val="single" w:color="000000" w:sz="4" w:space="0"/>
+          <w:insideV w:val="single" w:color="000000" w:sz="4" w:space="0"/>
         </w:tblBorders>
         <w:tblLook w:val="04A0" w:firstRow="1" w:lastRow="0" w:firstColumn="1" w:lastColumn="0" w:noHBand="0" w:noVBand="1"/>
       </w:tblPr>
@@ -4681,7 +4682,6 @@
                 <w:sz w:val="20"/>
                 <w:szCs w:val="20"/>
               </w:rPr>
-              <w:lastRenderedPageBreak/>
               <w:t>Nimi</w:t>
             </w:r>
           </w:p>
@@ -5272,12 +5272,12 @@
         <w:tblW w:w="0" w:type="auto"/>
         <w:tblInd w:w="-95" w:type="dxa"/>
         <w:tblBorders>
-          <w:top w:val="single" w:sz="4" w:space="0" w:color="000000"/>
-          <w:left w:val="single" w:sz="4" w:space="0" w:color="000000"/>
-          <w:bottom w:val="single" w:sz="4" w:space="0" w:color="000000"/>
-          <w:right w:val="single" w:sz="4" w:space="0" w:color="000000"/>
-          <w:insideH w:val="single" w:sz="4" w:space="0" w:color="000000"/>
-          <w:insideV w:val="single" w:sz="4" w:space="0" w:color="000000"/>
+          <w:top w:val="single" w:color="000000" w:sz="4" w:space="0"/>
+          <w:left w:val="single" w:color="000000" w:sz="4" w:space="0"/>
+          <w:bottom w:val="single" w:color="000000" w:sz="4" w:space="0"/>
+          <w:right w:val="single" w:color="000000" w:sz="4" w:space="0"/>
+          <w:insideH w:val="single" w:color="000000" w:sz="4" w:space="0"/>
+          <w:insideV w:val="single" w:color="000000" w:sz="4" w:space="0"/>
         </w:tblBorders>
         <w:tblLook w:val="04A0" w:firstRow="1" w:lastRow="0" w:firstColumn="1" w:lastColumn="0" w:noHBand="0" w:noVBand="1"/>
       </w:tblPr>
@@ -5869,12 +5869,12 @@
         <w:tblW w:w="0" w:type="auto"/>
         <w:tblInd w:w="-95" w:type="dxa"/>
         <w:tblBorders>
-          <w:top w:val="single" w:sz="4" w:space="0" w:color="000000"/>
-          <w:left w:val="single" w:sz="4" w:space="0" w:color="000000"/>
-          <w:bottom w:val="single" w:sz="4" w:space="0" w:color="000000"/>
-          <w:right w:val="single" w:sz="4" w:space="0" w:color="000000"/>
-          <w:insideH w:val="single" w:sz="4" w:space="0" w:color="000000"/>
-          <w:insideV w:val="single" w:sz="4" w:space="0" w:color="000000"/>
+          <w:top w:val="single" w:color="000000" w:sz="4" w:space="0"/>
+          <w:left w:val="single" w:color="000000" w:sz="4" w:space="0"/>
+          <w:bottom w:val="single" w:color="000000" w:sz="4" w:space="0"/>
+          <w:right w:val="single" w:color="000000" w:sz="4" w:space="0"/>
+          <w:insideH w:val="single" w:color="000000" w:sz="4" w:space="0"/>
+          <w:insideV w:val="single" w:color="000000" w:sz="4" w:space="0"/>
         </w:tblBorders>
         <w:tblLook w:val="04A0" w:firstRow="1" w:lastRow="0" w:firstColumn="1" w:lastColumn="0" w:noHBand="0" w:noVBand="1"/>
       </w:tblPr>
@@ -6407,7 +6407,6 @@
           <w:rFonts w:ascii="Verdana" w:hAnsi="Verdana" w:cs="Verdana"/>
           <w:color w:val="000000" w:themeColor="text1"/>
         </w:rPr>
-        <w:lastRenderedPageBreak/>
         <w:t xml:space="preserve">Oma käyttötapauskortti vaaditaan jokaisesta ryhmän määrittelemästä lisäominaisuudesta. </w:t>
       </w:r>
     </w:p>
@@ -6431,12 +6430,12 @@
         <w:tblW w:w="0" w:type="auto"/>
         <w:tblInd w:w="-95" w:type="dxa"/>
         <w:tblBorders>
-          <w:top w:val="single" w:sz="4" w:space="0" w:color="000000"/>
-          <w:left w:val="single" w:sz="4" w:space="0" w:color="000000"/>
-          <w:bottom w:val="single" w:sz="4" w:space="0" w:color="000000"/>
-          <w:right w:val="single" w:sz="4" w:space="0" w:color="000000"/>
-          <w:insideH w:val="single" w:sz="4" w:space="0" w:color="000000"/>
-          <w:insideV w:val="single" w:sz="4" w:space="0" w:color="000000"/>
+          <w:top w:val="single" w:color="000000" w:sz="4" w:space="0"/>
+          <w:left w:val="single" w:color="000000" w:sz="4" w:space="0"/>
+          <w:bottom w:val="single" w:color="000000" w:sz="4" w:space="0"/>
+          <w:right w:val="single" w:color="000000" w:sz="4" w:space="0"/>
+          <w:insideH w:val="single" w:color="000000" w:sz="4" w:space="0"/>
+          <w:insideV w:val="single" w:color="000000" w:sz="4" w:space="0"/>
         </w:tblBorders>
         <w:tblLook w:val="04A0" w:firstRow="1" w:lastRow="0" w:firstColumn="1" w:lastColumn="0" w:noHBand="0" w:noVBand="1"/>
       </w:tblPr>
@@ -6980,7 +6979,6 @@
           <w:sz w:val="24"/>
           <w:szCs w:val="24"/>
         </w:rPr>
-        <w:lastRenderedPageBreak/>
         <w:t>TIETOSISÄLTÖ</w:t>
       </w:r>
     </w:p>
@@ -6993,7 +6991,7 @@
           <w:szCs w:val="20"/>
         </w:rPr>
       </w:pPr>
-      <w:bookmarkStart w:id="6" w:name="_Projektin_tehtäväluettelo"/>
+      <w:bookmarkStart w:name="_Projektin_tehtäväluettelo" w:id="6"/>
       <w:bookmarkEnd w:id="6"/>
       <w:r>
         <w:rPr>
@@ -7079,7 +7077,7 @@
           <w:szCs w:val="24"/>
         </w:rPr>
       </w:pPr>
-      <w:bookmarkStart w:id="7" w:name="_Toc62403122"/>
+      <w:bookmarkStart w:name="_Toc62403122" w:id="7"/>
       <w:r>
         <w:rPr>
           <w:rFonts w:ascii="Verdana" w:hAnsi="Verdana" w:cs="Verdana"/>
@@ -7855,7 +7853,6 @@
           <w:bCs/>
           <w:color w:val="FF0000"/>
         </w:rPr>
-        <w:lastRenderedPageBreak/>
         <w:br/>
       </w:r>
     </w:p>
@@ -8091,7 +8088,6 @@
           <w:sz w:val="24"/>
           <w:szCs w:val="24"/>
         </w:rPr>
-        <w:lastRenderedPageBreak/>
         <w:t>JÄRJESTELMÄ</w:t>
       </w:r>
       <w:r>
@@ -8340,14 +8336,13 @@
           <w:szCs w:val="24"/>
         </w:rPr>
       </w:pPr>
-      <w:bookmarkStart w:id="8" w:name="_Toc183687125"/>
+      <w:bookmarkStart w:name="_Toc183687125" w:id="8"/>
       <w:r>
         <w:rPr>
           <w:rFonts w:ascii="Verdana" w:hAnsi="Verdana" w:cs="Verdana"/>
           <w:sz w:val="24"/>
           <w:szCs w:val="24"/>
         </w:rPr>
-        <w:lastRenderedPageBreak/>
         <w:t>KOMPONENTTIEN KUVAUKSET</w:t>
       </w:r>
     </w:p>
@@ -9075,7 +9070,6 @@
           <w:bCs/>
           <w:color w:val="000000" w:themeColor="text1"/>
         </w:rPr>
-        <w:lastRenderedPageBreak/>
         <w:t>Service Client PC (Qt)</w:t>
       </w:r>
     </w:p>
@@ -9094,12 +9088,12 @@
         <w:tblW w:w="9588" w:type="dxa"/>
         <w:tblInd w:w="61" w:type="dxa"/>
         <w:tblBorders>
-          <w:top w:val="single" w:sz="4" w:space="0" w:color="auto"/>
-          <w:left w:val="single" w:sz="4" w:space="0" w:color="auto"/>
-          <w:bottom w:val="single" w:sz="4" w:space="0" w:color="auto"/>
-          <w:right w:val="single" w:sz="4" w:space="0" w:color="auto"/>
-          <w:insideH w:val="single" w:sz="4" w:space="0" w:color="auto"/>
-          <w:insideV w:val="single" w:sz="4" w:space="0" w:color="auto"/>
+          <w:top w:val="single" w:color="auto" w:sz="4" w:space="0"/>
+          <w:left w:val="single" w:color="auto" w:sz="4" w:space="0"/>
+          <w:bottom w:val="single" w:color="auto" w:sz="4" w:space="0"/>
+          <w:right w:val="single" w:color="auto" w:sz="4" w:space="0"/>
+          <w:insideH w:val="single" w:color="auto" w:sz="4" w:space="0"/>
+          <w:insideV w:val="single" w:color="auto" w:sz="4" w:space="0"/>
         </w:tblBorders>
         <w:tblCellMar>
           <w:left w:w="70" w:type="dxa"/>
@@ -9409,12 +9403,12 @@
               <w:tblOverlap w:val="never"/>
               <w:tblW w:w="0" w:type="auto"/>
               <w:tblBorders>
-                <w:top w:val="single" w:sz="4" w:space="0" w:color="auto"/>
-                <w:left w:val="single" w:sz="4" w:space="0" w:color="auto"/>
-                <w:bottom w:val="single" w:sz="4" w:space="0" w:color="auto"/>
-                <w:right w:val="single" w:sz="4" w:space="0" w:color="auto"/>
-                <w:insideH w:val="single" w:sz="4" w:space="0" w:color="auto"/>
-                <w:insideV w:val="single" w:sz="4" w:space="0" w:color="auto"/>
+                <w:top w:val="single" w:color="auto" w:sz="4" w:space="0"/>
+                <w:left w:val="single" w:color="auto" w:sz="4" w:space="0"/>
+                <w:bottom w:val="single" w:color="auto" w:sz="4" w:space="0"/>
+                <w:right w:val="single" w:color="auto" w:sz="4" w:space="0"/>
+                <w:insideH w:val="single" w:color="auto" w:sz="4" w:space="0"/>
+                <w:insideV w:val="single" w:color="auto" w:sz="4" w:space="0"/>
               </w:tblBorders>
               <w:tblCellMar>
                 <w:left w:w="70" w:type="dxa"/>
@@ -9747,7 +9741,6 @@
           <w:iCs/>
           <w:color w:val="FF0000"/>
         </w:rPr>
-        <w:lastRenderedPageBreak/>
         <w:br w:type="page"/>
       </w:r>
     </w:p>
@@ -9769,7 +9762,6 @@
           <w:bCs/>
           <w:color w:val="000000" w:themeColor="text1"/>
         </w:rPr>
-        <w:lastRenderedPageBreak/>
         <w:t>Application Server</w:t>
       </w:r>
     </w:p>
@@ -9790,12 +9782,12 @@
         <w:tblW w:w="10019" w:type="dxa"/>
         <w:tblInd w:w="-5" w:type="dxa"/>
         <w:tblBorders>
-          <w:top w:val="single" w:sz="4" w:space="0" w:color="auto"/>
-          <w:left w:val="single" w:sz="4" w:space="0" w:color="auto"/>
-          <w:bottom w:val="single" w:sz="4" w:space="0" w:color="auto"/>
-          <w:right w:val="single" w:sz="4" w:space="0" w:color="auto"/>
-          <w:insideH w:val="single" w:sz="4" w:space="0" w:color="auto"/>
-          <w:insideV w:val="single" w:sz="4" w:space="0" w:color="auto"/>
+          <w:top w:val="single" w:color="auto" w:sz="4" w:space="0"/>
+          <w:left w:val="single" w:color="auto" w:sz="4" w:space="0"/>
+          <w:bottom w:val="single" w:color="auto" w:sz="4" w:space="0"/>
+          <w:right w:val="single" w:color="auto" w:sz="4" w:space="0"/>
+          <w:insideH w:val="single" w:color="auto" w:sz="4" w:space="0"/>
+          <w:insideV w:val="single" w:color="auto" w:sz="4" w:space="0"/>
         </w:tblBorders>
         <w:tblCellMar>
           <w:left w:w="70" w:type="dxa"/>
@@ -10072,12 +10064,12 @@
               <w:tblOverlap w:val="never"/>
               <w:tblW w:w="0" w:type="auto"/>
               <w:tblBorders>
-                <w:top w:val="single" w:sz="4" w:space="0" w:color="auto"/>
-                <w:left w:val="single" w:sz="4" w:space="0" w:color="auto"/>
-                <w:bottom w:val="single" w:sz="4" w:space="0" w:color="auto"/>
-                <w:right w:val="single" w:sz="4" w:space="0" w:color="auto"/>
-                <w:insideH w:val="single" w:sz="4" w:space="0" w:color="auto"/>
-                <w:insideV w:val="single" w:sz="4" w:space="0" w:color="auto"/>
+                <w:top w:val="single" w:color="auto" w:sz="4" w:space="0"/>
+                <w:left w:val="single" w:color="auto" w:sz="4" w:space="0"/>
+                <w:bottom w:val="single" w:color="auto" w:sz="4" w:space="0"/>
+                <w:right w:val="single" w:color="auto" w:sz="4" w:space="0"/>
+                <w:insideH w:val="single" w:color="auto" w:sz="4" w:space="0"/>
+                <w:insideV w:val="single" w:color="auto" w:sz="4" w:space="0"/>
               </w:tblBorders>
               <w:tblCellMar>
                 <w:left w:w="70" w:type="dxa"/>
@@ -10499,12 +10491,12 @@
         <w:tblpPr w:leftFromText="141" w:rightFromText="141" w:horzAnchor="margin" w:tblpXSpec="center" w:tblpY="540"/>
         <w:tblW w:w="10474" w:type="dxa"/>
         <w:tblBorders>
-          <w:top w:val="single" w:sz="4" w:space="0" w:color="auto"/>
-          <w:left w:val="single" w:sz="4" w:space="0" w:color="auto"/>
-          <w:bottom w:val="single" w:sz="4" w:space="0" w:color="auto"/>
-          <w:right w:val="single" w:sz="4" w:space="0" w:color="auto"/>
-          <w:insideH w:val="single" w:sz="4" w:space="0" w:color="auto"/>
-          <w:insideV w:val="single" w:sz="4" w:space="0" w:color="auto"/>
+          <w:top w:val="single" w:color="auto" w:sz="4" w:space="0"/>
+          <w:left w:val="single" w:color="auto" w:sz="4" w:space="0"/>
+          <w:bottom w:val="single" w:color="auto" w:sz="4" w:space="0"/>
+          <w:right w:val="single" w:color="auto" w:sz="4" w:space="0"/>
+          <w:insideH w:val="single" w:color="auto" w:sz="4" w:space="0"/>
+          <w:insideV w:val="single" w:color="auto" w:sz="4" w:space="0"/>
         </w:tblBorders>
         <w:tblCellMar>
           <w:left w:w="70" w:type="dxa"/>
@@ -10545,7 +10537,6 @@
                 <w:sz w:val="20"/>
                 <w:szCs w:val="20"/>
               </w:rPr>
-              <w:lastRenderedPageBreak/>
               <w:t>Tarkoitus ja toiminta</w:t>
             </w:r>
           </w:p>
@@ -10780,12 +10771,12 @@
               <w:tblOverlap w:val="never"/>
               <w:tblW w:w="0" w:type="auto"/>
               <w:tblBorders>
-                <w:top w:val="single" w:sz="4" w:space="0" w:color="auto"/>
-                <w:left w:val="single" w:sz="4" w:space="0" w:color="auto"/>
-                <w:bottom w:val="single" w:sz="4" w:space="0" w:color="auto"/>
-                <w:right w:val="single" w:sz="4" w:space="0" w:color="auto"/>
-                <w:insideH w:val="single" w:sz="4" w:space="0" w:color="auto"/>
-                <w:insideV w:val="single" w:sz="4" w:space="0" w:color="auto"/>
+                <w:top w:val="single" w:color="auto" w:sz="4" w:space="0"/>
+                <w:left w:val="single" w:color="auto" w:sz="4" w:space="0"/>
+                <w:bottom w:val="single" w:color="auto" w:sz="4" w:space="0"/>
+                <w:right w:val="single" w:color="auto" w:sz="4" w:space="0"/>
+                <w:insideH w:val="single" w:color="auto" w:sz="4" w:space="0"/>
+                <w:insideV w:val="single" w:color="auto" w:sz="4" w:space="0"/>
               </w:tblBorders>
               <w:tblCellMar>
                 <w:left w:w="70" w:type="dxa"/>
@@ -11191,7 +11182,6 @@
           <w:sz w:val="24"/>
           <w:szCs w:val="24"/>
         </w:rPr>
-        <w:lastRenderedPageBreak/>
         <w:t>KÄYTTÖLIITTYMÄN KUVAUS</w:t>
       </w:r>
     </w:p>
@@ -11261,7 +11251,7 @@
           <w:szCs w:val="24"/>
         </w:rPr>
       </w:pPr>
-      <w:bookmarkStart w:id="9" w:name="_Toc183687126"/>
+      <w:bookmarkStart w:name="_Toc183687126" w:id="9"/>
       <w:r>
         <w:rPr>
           <w:rFonts w:ascii="Verdana" w:hAnsi="Verdana" w:cs="Verdana"/>
@@ -11459,8 +11449,8 @@
                   </w:drawing>
                 </mc:Choice>
                 <mc:Fallback>
-                  <w:pict>
-                    <v:rect w14:anchorId="617C6772" id="Suorakulmio 1" o:spid="_x0000_s1028" style="position:absolute;margin-left:-4.75pt;margin-top:3.2pt;width:481.2pt;height:354.6pt;z-index:251661312;visibility:visible;mso-wrap-style:square;mso-width-percent:0;mso-height-percent:0;mso-wrap-distance-left:9pt;mso-wrap-distance-top:0;mso-wrap-distance-right:9pt;mso-wrap-distance-bottom:0;mso-position-horizontal:absolute;mso-position-horizontal-relative:text;mso-position-vertical:absolute;mso-position-vertical-relative:text;mso-width-percent:0;mso-height-percent:0;mso-width-relative:margin;mso-height-relative:margin;v-text-anchor:middle" o:gfxdata="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" fillcolor="white [3212]" strokecolor="#091723 [484]" strokeweight="1pt">
+                  <w:pict w14:anchorId="149A7F1E">
+                    <v:rect id="Suorakulmio 1" style="position:absolute;margin-left:-4.75pt;margin-top:3.2pt;width:481.2pt;height:354.6pt;z-index:251661312;visibility:visible;mso-wrap-style:square;mso-width-percent:0;mso-height-percent:0;mso-wrap-distance-left:9pt;mso-wrap-distance-top:0;mso-wrap-distance-right:9pt;mso-wrap-distance-bottom:0;mso-position-horizontal:absolute;mso-position-horizontal-relative:text;mso-position-vertical:absolute;mso-position-vertical-relative:text;mso-width-percent:0;mso-height-percent:0;mso-width-relative:margin;mso-height-relative:margin;v-text-anchor:middle" o:spid="_x0000_s1028" fillcolor="white [3212]" strokecolor="#091723 [484]" strokeweight="1pt" w14:anchorId="617C6772" o:gfxdata="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">
                       <v:textbox>
                         <w:txbxContent>
                           <w:p>
@@ -11477,10 +11467,10 @@
                                 <w:lang w:eastAsia="fi-FI"/>
                               </w:rPr>
                               <w:drawing>
-                                <wp:inline distT="0" distB="0" distL="0" distR="0" wp14:anchorId="360F0AE0" wp14:editId="52188535">
+                                <wp:inline distT="0" distB="0" distL="0" distR="0" wp14:anchorId="096EC626" wp14:editId="52188535">
                                   <wp:extent cx="4831080" cy="4119245"/>
                                   <wp:effectExtent l="0" t="0" r="7620" b="0"/>
-                                  <wp:docPr id="1727758613" name="Kuva 2"/>
+                                  <wp:docPr id="1655072650" name="Kuva 2"/>
                                   <wp:cNvGraphicFramePr>
                                     <a:graphicFrameLocks xmlns:a="http://schemas.openxmlformats.org/drawingml/2006/main" noChangeAspect="1"/>
                                   </wp:cNvGraphicFramePr>
@@ -11609,7 +11599,6 @@
           <w:sz w:val="24"/>
           <w:szCs w:val="24"/>
         </w:rPr>
-        <w:lastRenderedPageBreak/>
         <w:t>Ohjelman käyttöliittymät</w:t>
       </w:r>
       <w:bookmarkEnd w:id="9"/>
@@ -11687,40 +11676,113 @@
         <w:tc>
           <w:tcPr>
             <w:tcW w:w="4949" w:type="dxa"/>
+            <w:tcMar/>
           </w:tcPr>
           <w:p>
             <w:pPr>
+              <w:pStyle w:val="Normaali"/>
               <w:autoSpaceDE/>
               <w:autoSpaceDN/>
-              <w:rPr>
-                <w:rFonts w:ascii="Verdana" w:hAnsi="Verdana" w:cs="Verdana"/>
-                <w:i/>
-                <w:iCs/>
-              </w:rPr>
-            </w:pPr>
-            <w:r>
-              <w:rPr>
-                <w:rFonts w:ascii="Verdana" w:hAnsi="Verdana" w:cs="Verdana"/>
-                <w:i/>
-                <w:iCs/>
-                <w:color w:val="FF0000"/>
-              </w:rPr>
-              <w:t>Kuvat tänne.</w:t>
+            </w:pPr>
+            <w:r>
+              <w:drawing>
+                <wp:inline wp14:editId="1416E841" wp14:anchorId="2870708C">
+                  <wp:extent cx="2990850" cy="1981200"/>
+                  <wp:effectExtent l="0" t="0" r="0" b="0"/>
+                  <wp:docPr id="1845552226" name="drawing"/>
+                  <wp:cNvGraphicFramePr>
+                    <a:graphicFrameLocks noChangeAspect="1"/>
+                  </wp:cNvGraphicFramePr>
+                  <a:graphic>
+                    <a:graphicData xmlns:a="http://schemas.openxmlformats.org/drawingml/2006/main" uri="http://schemas.openxmlformats.org/drawingml/2006/picture">
+                      <pic:pic xmlns:pic="http://schemas.openxmlformats.org/drawingml/2006/picture">
+                        <pic:nvPicPr>
+                          <pic:cNvPr id="1845552226" name="Picture 1845552226"/>
+                          <pic:cNvPicPr/>
+                        </pic:nvPicPr>
+                        <pic:blipFill>
+                          <a:blip xmlns:r="http://schemas.openxmlformats.org/officeDocument/2006/relationships" r:embed="rId994162877">
+                            <a:extLst>
+                              <a:ext uri="{28A0092B-C50C-407E-A947-70E740481C1C}">
+                                <a14:useLocalDpi xmlns:a14="http://schemas.microsoft.com/office/drawing/2010/main"/>
+                              </a:ext>
+                            </a:extLst>
+                          </a:blip>
+                          <a:stretch>
+                            <a:fillRect/>
+                          </a:stretch>
+                        </pic:blipFill>
+                        <pic:spPr>
+                          <a:xfrm>
+                            <a:off x="0" y="0"/>
+                            <a:ext cx="2990850" cy="1981200"/>
+                          </a:xfrm>
+                          <a:prstGeom prst="rect">
+                            <a:avLst/>
+                          </a:prstGeom>
+                        </pic:spPr>
+                      </pic:pic>
+                    </a:graphicData>
+                  </a:graphic>
+                </wp:inline>
+              </w:drawing>
             </w:r>
           </w:p>
         </w:tc>
         <w:tc>
           <w:tcPr>
             <w:tcW w:w="4949" w:type="dxa"/>
+            <w:tcMar/>
           </w:tcPr>
           <w:p>
             <w:pPr>
+              <w:pStyle w:val="Normaali"/>
               <w:autoSpaceDE/>
               <w:autoSpaceDN/>
-              <w:rPr>
-                <w:rFonts w:ascii="Verdana" w:hAnsi="Verdana" w:cs="Verdana"/>
-              </w:rPr>
-            </w:pPr>
+            </w:pPr>
+            <w:r>
+              <w:drawing>
+                <wp:inline wp14:editId="057F70B2" wp14:anchorId="55BC8FE2">
+                  <wp:extent cx="2990850" cy="1981200"/>
+                  <wp:effectExtent l="0" t="0" r="0" b="0"/>
+                  <wp:docPr id="485772549" name="drawing"/>
+                  <wp:cNvGraphicFramePr>
+                    <a:graphicFrameLocks noChangeAspect="1"/>
+                  </wp:cNvGraphicFramePr>
+                  <a:graphic>
+                    <a:graphicData xmlns:a="http://schemas.openxmlformats.org/drawingml/2006/main" uri="http://schemas.openxmlformats.org/drawingml/2006/picture">
+                      <pic:pic xmlns:pic="http://schemas.openxmlformats.org/drawingml/2006/picture">
+                        <pic:nvPicPr>
+                          <pic:cNvPr id="485772549" name="Picture 485772549"/>
+                          <pic:cNvPicPr/>
+                        </pic:nvPicPr>
+                        <pic:blipFill>
+                          <a:blip xmlns:r="http://schemas.openxmlformats.org/officeDocument/2006/relationships" r:embed="rId1696149072">
+                            <a:extLst>
+                              <a:ext uri="{28A0092B-C50C-407E-A947-70E740481C1C}">
+                                <a14:useLocalDpi xmlns:a14="http://schemas.microsoft.com/office/drawing/2010/main"/>
+                              </a:ext>
+                            </a:extLst>
+                          </a:blip>
+                          <a:stretch>
+                            <a:fillRect/>
+                          </a:stretch>
+                        </pic:blipFill>
+                        <pic:spPr>
+                          <a:xfrm>
+                            <a:off x="0" y="0"/>
+                            <a:ext cx="2990850" cy="1981200"/>
+                          </a:xfrm>
+                          <a:prstGeom prst="rect">
+                            <a:avLst/>
+                          </a:prstGeom>
+                        </pic:spPr>
+                      </pic:pic>
+                    </a:graphicData>
+                  </a:graphic>
+                </wp:inline>
+              </w:drawing>
+            </w:r>
           </w:p>
         </w:tc>
       </w:tr>
@@ -11731,29 +11793,113 @@
         <w:tc>
           <w:tcPr>
             <w:tcW w:w="4949" w:type="dxa"/>
+            <w:tcMar/>
           </w:tcPr>
           <w:p>
             <w:pPr>
+              <w:pStyle w:val="Normaali"/>
               <w:autoSpaceDE/>
               <w:autoSpaceDN/>
-              <w:rPr>
-                <w:rFonts w:ascii="Verdana" w:hAnsi="Verdana" w:cs="Verdana"/>
-              </w:rPr>
-            </w:pPr>
+            </w:pPr>
+            <w:r>
+              <w:drawing>
+                <wp:inline wp14:editId="78F97043" wp14:anchorId="59A915B3">
+                  <wp:extent cx="2990850" cy="2105025"/>
+                  <wp:effectExtent l="0" t="0" r="0" b="0"/>
+                  <wp:docPr id="147306232" name="drawing"/>
+                  <wp:cNvGraphicFramePr>
+                    <a:graphicFrameLocks noChangeAspect="1"/>
+                  </wp:cNvGraphicFramePr>
+                  <a:graphic>
+                    <a:graphicData xmlns:a="http://schemas.openxmlformats.org/drawingml/2006/main" uri="http://schemas.openxmlformats.org/drawingml/2006/picture">
+                      <pic:pic xmlns:pic="http://schemas.openxmlformats.org/drawingml/2006/picture">
+                        <pic:nvPicPr>
+                          <pic:cNvPr id="147306232" name="Picture 147306232"/>
+                          <pic:cNvPicPr/>
+                        </pic:nvPicPr>
+                        <pic:blipFill>
+                          <a:blip xmlns:r="http://schemas.openxmlformats.org/officeDocument/2006/relationships" r:embed="rId1256029187">
+                            <a:extLst>
+                              <a:ext uri="{28A0092B-C50C-407E-A947-70E740481C1C}">
+                                <a14:useLocalDpi xmlns:a14="http://schemas.microsoft.com/office/drawing/2010/main"/>
+                              </a:ext>
+                            </a:extLst>
+                          </a:blip>
+                          <a:stretch>
+                            <a:fillRect/>
+                          </a:stretch>
+                        </pic:blipFill>
+                        <pic:spPr>
+                          <a:xfrm>
+                            <a:off x="0" y="0"/>
+                            <a:ext cx="2990850" cy="2105025"/>
+                          </a:xfrm>
+                          <a:prstGeom prst="rect">
+                            <a:avLst/>
+                          </a:prstGeom>
+                        </pic:spPr>
+                      </pic:pic>
+                    </a:graphicData>
+                  </a:graphic>
+                </wp:inline>
+              </w:drawing>
+            </w:r>
           </w:p>
         </w:tc>
         <w:tc>
           <w:tcPr>
             <w:tcW w:w="4949" w:type="dxa"/>
+            <w:tcMar/>
           </w:tcPr>
           <w:p>
             <w:pPr>
+              <w:pStyle w:val="Normaali"/>
               <w:autoSpaceDE/>
               <w:autoSpaceDN/>
-              <w:rPr>
-                <w:rFonts w:ascii="Verdana" w:hAnsi="Verdana" w:cs="Verdana"/>
-              </w:rPr>
-            </w:pPr>
+            </w:pPr>
+            <w:r>
+              <w:drawing>
+                <wp:inline wp14:editId="56C5FAC9" wp14:anchorId="7588A1E8">
+                  <wp:extent cx="2990850" cy="2095500"/>
+                  <wp:effectExtent l="0" t="0" r="0" b="0"/>
+                  <wp:docPr id="83887145" name="drawing"/>
+                  <wp:cNvGraphicFramePr>
+                    <a:graphicFrameLocks noChangeAspect="1"/>
+                  </wp:cNvGraphicFramePr>
+                  <a:graphic>
+                    <a:graphicData xmlns:a="http://schemas.openxmlformats.org/drawingml/2006/main" uri="http://schemas.openxmlformats.org/drawingml/2006/picture">
+                      <pic:pic xmlns:pic="http://schemas.openxmlformats.org/drawingml/2006/picture">
+                        <pic:nvPicPr>
+                          <pic:cNvPr id="83887145" name="Picture 83887145"/>
+                          <pic:cNvPicPr/>
+                        </pic:nvPicPr>
+                        <pic:blipFill>
+                          <a:blip xmlns:r="http://schemas.openxmlformats.org/officeDocument/2006/relationships" r:embed="rId1948336466">
+                            <a:extLst>
+                              <a:ext uri="{28A0092B-C50C-407E-A947-70E740481C1C}">
+                                <a14:useLocalDpi xmlns:a14="http://schemas.microsoft.com/office/drawing/2010/main"/>
+                              </a:ext>
+                            </a:extLst>
+                          </a:blip>
+                          <a:stretch>
+                            <a:fillRect/>
+                          </a:stretch>
+                        </pic:blipFill>
+                        <pic:spPr>
+                          <a:xfrm>
+                            <a:off x="0" y="0"/>
+                            <a:ext cx="2990850" cy="2095500"/>
+                          </a:xfrm>
+                          <a:prstGeom prst="rect">
+                            <a:avLst/>
+                          </a:prstGeom>
+                        </pic:spPr>
+                      </pic:pic>
+                    </a:graphicData>
+                  </a:graphic>
+                </wp:inline>
+              </w:drawing>
+            </w:r>
           </w:p>
         </w:tc>
       </w:tr>
@@ -11790,7 +11936,6 @@
           <w:sz w:val="24"/>
           <w:szCs w:val="24"/>
         </w:rPr>
-        <w:lastRenderedPageBreak/>
         <w:t>LIITTEET</w:t>
       </w:r>
     </w:p>
@@ -11872,7 +12017,7 @@
       </w:pPr>
     </w:p>
     <w:sectPr>
-      <w:pgSz w:w="11906" w:h="16838" w:code="9"/>
+      <w:pgSz w:w="11906" w:h="16838" w:orient="portrait" w:code="9"/>
       <w:pgMar w:top="1418" w:right="1134" w:bottom="1418" w:left="1134" w:header="709" w:footer="709" w:gutter="0"/>
       <w:cols w:space="708"/>
       <w:docGrid w:linePitch="360"/>
@@ -12052,7 +12197,7 @@
         <w:ind w:left="360" w:hanging="360"/>
       </w:pPr>
       <w:rPr>
-        <w:rFonts w:cs="Times New Roman" w:hint="default"/>
+        <w:rFonts w:hint="default" w:cs="Times New Roman"/>
       </w:rPr>
     </w:lvl>
     <w:lvl w:ilvl="1">
@@ -12082,7 +12227,7 @@
         <w:ind w:left="1803" w:hanging="180"/>
       </w:pPr>
       <w:rPr>
-        <w:rFonts w:cs="Times New Roman" w:hint="default"/>
+        <w:rFonts w:hint="default" w:cs="Times New Roman"/>
       </w:rPr>
     </w:lvl>
     <w:lvl w:ilvl="3">
@@ -12097,7 +12242,7 @@
         <w:ind w:left="2523" w:hanging="360"/>
       </w:pPr>
       <w:rPr>
-        <w:rFonts w:cs="Times New Roman" w:hint="default"/>
+        <w:rFonts w:hint="default" w:cs="Times New Roman"/>
       </w:rPr>
     </w:lvl>
     <w:lvl w:ilvl="4">
@@ -12112,7 +12257,7 @@
         <w:ind w:left="3243" w:hanging="360"/>
       </w:pPr>
       <w:rPr>
-        <w:rFonts w:cs="Times New Roman" w:hint="default"/>
+        <w:rFonts w:hint="default" w:cs="Times New Roman"/>
       </w:rPr>
     </w:lvl>
     <w:lvl w:ilvl="5">
@@ -12127,7 +12272,7 @@
         <w:ind w:left="3963" w:hanging="180"/>
       </w:pPr>
       <w:rPr>
-        <w:rFonts w:cs="Times New Roman" w:hint="default"/>
+        <w:rFonts w:hint="default" w:cs="Times New Roman"/>
       </w:rPr>
     </w:lvl>
     <w:lvl w:ilvl="6">
@@ -12142,7 +12287,7 @@
         <w:ind w:left="4683" w:hanging="360"/>
       </w:pPr>
       <w:rPr>
-        <w:rFonts w:cs="Times New Roman" w:hint="default"/>
+        <w:rFonts w:hint="default" w:cs="Times New Roman"/>
       </w:rPr>
     </w:lvl>
     <w:lvl w:ilvl="7">
@@ -12157,7 +12302,7 @@
         <w:ind w:left="5403" w:hanging="360"/>
       </w:pPr>
       <w:rPr>
-        <w:rFonts w:cs="Times New Roman" w:hint="default"/>
+        <w:rFonts w:hint="default" w:cs="Times New Roman"/>
       </w:rPr>
     </w:lvl>
     <w:lvl w:ilvl="8">
@@ -12172,7 +12317,7 @@
         <w:ind w:left="6123" w:hanging="180"/>
       </w:pPr>
       <w:rPr>
-        <w:rFonts w:cs="Times New Roman" w:hint="default"/>
+        <w:rFonts w:hint="default" w:cs="Times New Roman"/>
       </w:rPr>
     </w:lvl>
   </w:abstractNum>
@@ -12191,7 +12336,7 @@
         <w:ind w:left="720" w:hanging="360"/>
       </w:pPr>
       <w:rPr>
-        <w:rFonts w:ascii="Verdana" w:eastAsia="Times New Roman" w:hAnsi="Verdana" w:cs="Times New Roman" w:hint="default"/>
+        <w:rFonts w:hint="default" w:ascii="Verdana" w:hAnsi="Verdana" w:eastAsia="Times New Roman" w:cs="Times New Roman"/>
       </w:rPr>
     </w:lvl>
     <w:lvl w:ilvl="1" w:tplc="6422E4D4">
@@ -12205,7 +12350,7 @@
         <w:ind w:left="1440" w:hanging="360"/>
       </w:pPr>
       <w:rPr>
-        <w:rFonts w:ascii="Symbol" w:eastAsia="Times New Roman" w:hAnsi="Symbol" w:cs="Times New Roman" w:hint="default"/>
+        <w:rFonts w:hint="default" w:ascii="Symbol" w:hAnsi="Symbol" w:eastAsia="Times New Roman" w:cs="Times New Roman"/>
       </w:rPr>
     </w:lvl>
     <w:lvl w:ilvl="2" w:tplc="04090005">
@@ -12220,7 +12365,7 @@
         <w:ind w:left="2160" w:hanging="360"/>
       </w:pPr>
       <w:rPr>
-        <w:rFonts w:ascii="Wingdings" w:hAnsi="Wingdings" w:hint="default"/>
+        <w:rFonts w:hint="default" w:ascii="Wingdings" w:hAnsi="Wingdings"/>
       </w:rPr>
     </w:lvl>
     <w:lvl w:ilvl="3" w:tplc="04090001">
@@ -12235,7 +12380,7 @@
         <w:ind w:left="2880" w:hanging="360"/>
       </w:pPr>
       <w:rPr>
-        <w:rFonts w:ascii="Symbol" w:hAnsi="Symbol" w:hint="default"/>
+        <w:rFonts w:hint="default" w:ascii="Symbol" w:hAnsi="Symbol"/>
       </w:rPr>
     </w:lvl>
     <w:lvl w:ilvl="4" w:tplc="04090003" w:tentative="1">
@@ -12250,7 +12395,7 @@
         <w:ind w:left="3600" w:hanging="360"/>
       </w:pPr>
       <w:rPr>
-        <w:rFonts w:ascii="Courier New" w:hAnsi="Courier New" w:cs="Courier New" w:hint="default"/>
+        <w:rFonts w:hint="default" w:ascii="Courier New" w:hAnsi="Courier New" w:cs="Courier New"/>
       </w:rPr>
     </w:lvl>
     <w:lvl w:ilvl="5" w:tplc="04090005" w:tentative="1">
@@ -12265,7 +12410,7 @@
         <w:ind w:left="4320" w:hanging="360"/>
       </w:pPr>
       <w:rPr>
-        <w:rFonts w:ascii="Wingdings" w:hAnsi="Wingdings" w:hint="default"/>
+        <w:rFonts w:hint="default" w:ascii="Wingdings" w:hAnsi="Wingdings"/>
       </w:rPr>
     </w:lvl>
     <w:lvl w:ilvl="6" w:tplc="04090001" w:tentative="1">
@@ -12280,7 +12425,7 @@
         <w:ind w:left="5040" w:hanging="360"/>
       </w:pPr>
       <w:rPr>
-        <w:rFonts w:ascii="Symbol" w:hAnsi="Symbol" w:hint="default"/>
+        <w:rFonts w:hint="default" w:ascii="Symbol" w:hAnsi="Symbol"/>
       </w:rPr>
     </w:lvl>
     <w:lvl w:ilvl="7" w:tplc="04090003" w:tentative="1">
@@ -12295,7 +12440,7 @@
         <w:ind w:left="5760" w:hanging="360"/>
       </w:pPr>
       <w:rPr>
-        <w:rFonts w:ascii="Courier New" w:hAnsi="Courier New" w:cs="Courier New" w:hint="default"/>
+        <w:rFonts w:hint="default" w:ascii="Courier New" w:hAnsi="Courier New" w:cs="Courier New"/>
       </w:rPr>
     </w:lvl>
     <w:lvl w:ilvl="8" w:tplc="04090005" w:tentative="1">
@@ -12310,7 +12455,7 @@
         <w:ind w:left="6480" w:hanging="360"/>
       </w:pPr>
       <w:rPr>
-        <w:rFonts w:ascii="Wingdings" w:hAnsi="Wingdings" w:hint="default"/>
+        <w:rFonts w:hint="default" w:ascii="Wingdings" w:hAnsi="Wingdings"/>
       </w:rPr>
     </w:lvl>
   </w:abstractNum>
@@ -12558,7 +12703,7 @@
         <w:ind w:left="510" w:hanging="510"/>
       </w:pPr>
       <w:rPr>
-        <w:rFonts w:cs="Times New Roman" w:hint="default"/>
+        <w:rFonts w:hint="default" w:cs="Times New Roman"/>
       </w:rPr>
     </w:lvl>
     <w:lvl w:ilvl="1">
@@ -12573,7 +12718,7 @@
         <w:ind w:left="1077" w:hanging="720"/>
       </w:pPr>
       <w:rPr>
-        <w:rFonts w:cs="Times New Roman" w:hint="default"/>
+        <w:rFonts w:hint="default" w:cs="Times New Roman"/>
       </w:rPr>
     </w:lvl>
     <w:lvl w:ilvl="2">
@@ -12588,7 +12733,7 @@
         <w:ind w:left="1794" w:hanging="1080"/>
       </w:pPr>
       <w:rPr>
-        <w:rFonts w:cs="Times New Roman" w:hint="default"/>
+        <w:rFonts w:hint="default" w:cs="Times New Roman"/>
       </w:rPr>
     </w:lvl>
     <w:lvl w:ilvl="3">
@@ -12603,7 +12748,7 @@
         <w:ind w:left="2511" w:hanging="1440"/>
       </w:pPr>
       <w:rPr>
-        <w:rFonts w:cs="Times New Roman" w:hint="default"/>
+        <w:rFonts w:hint="default" w:cs="Times New Roman"/>
       </w:rPr>
     </w:lvl>
     <w:lvl w:ilvl="4">
@@ -12618,7 +12763,7 @@
         <w:ind w:left="3228" w:hanging="1800"/>
       </w:pPr>
       <w:rPr>
-        <w:rFonts w:cs="Times New Roman" w:hint="default"/>
+        <w:rFonts w:hint="default" w:cs="Times New Roman"/>
       </w:rPr>
     </w:lvl>
     <w:lvl w:ilvl="5">
@@ -12633,7 +12778,7 @@
         <w:ind w:left="3945" w:hanging="2160"/>
       </w:pPr>
       <w:rPr>
-        <w:rFonts w:cs="Times New Roman" w:hint="default"/>
+        <w:rFonts w:hint="default" w:cs="Times New Roman"/>
       </w:rPr>
     </w:lvl>
     <w:lvl w:ilvl="6">
@@ -12648,7 +12793,7 @@
         <w:ind w:left="4662" w:hanging="2520"/>
       </w:pPr>
       <w:rPr>
-        <w:rFonts w:cs="Times New Roman" w:hint="default"/>
+        <w:rFonts w:hint="default" w:cs="Times New Roman"/>
       </w:rPr>
     </w:lvl>
     <w:lvl w:ilvl="7">
@@ -12663,7 +12808,7 @@
         <w:ind w:left="5379" w:hanging="2880"/>
       </w:pPr>
       <w:rPr>
-        <w:rFonts w:cs="Times New Roman" w:hint="default"/>
+        <w:rFonts w:hint="default" w:cs="Times New Roman"/>
       </w:rPr>
     </w:lvl>
     <w:lvl w:ilvl="8">
@@ -12678,7 +12823,7 @@
         <w:ind w:left="6096" w:hanging="3240"/>
       </w:pPr>
       <w:rPr>
-        <w:rFonts w:cs="Times New Roman" w:hint="default"/>
+        <w:rFonts w:hint="default" w:cs="Times New Roman"/>
       </w:rPr>
     </w:lvl>
   </w:abstractNum>
@@ -13099,7 +13244,7 @@
         <w:ind w:left="600" w:hanging="600"/>
       </w:pPr>
       <w:rPr>
-        <w:rFonts w:cs="Times New Roman" w:hint="default"/>
+        <w:rFonts w:hint="default" w:cs="Times New Roman"/>
       </w:rPr>
     </w:lvl>
     <w:lvl w:ilvl="1">
@@ -13114,7 +13259,7 @@
         <w:ind w:left="957" w:hanging="600"/>
       </w:pPr>
       <w:rPr>
-        <w:rFonts w:cs="Times New Roman" w:hint="default"/>
+        <w:rFonts w:hint="default" w:cs="Times New Roman"/>
       </w:rPr>
     </w:lvl>
     <w:lvl w:ilvl="2">
@@ -13129,7 +13274,7 @@
         <w:ind w:left="1434" w:hanging="720"/>
       </w:pPr>
       <w:rPr>
-        <w:rFonts w:cs="Times New Roman" w:hint="default"/>
+        <w:rFonts w:hint="default" w:cs="Times New Roman"/>
       </w:rPr>
     </w:lvl>
     <w:lvl w:ilvl="3">
@@ -13144,7 +13289,7 @@
         <w:ind w:left="1791" w:hanging="720"/>
       </w:pPr>
       <w:rPr>
-        <w:rFonts w:cs="Times New Roman" w:hint="default"/>
+        <w:rFonts w:hint="default" w:cs="Times New Roman"/>
       </w:rPr>
     </w:lvl>
     <w:lvl w:ilvl="4">
@@ -13159,7 +13304,7 @@
         <w:ind w:left="2508" w:hanging="1080"/>
       </w:pPr>
       <w:rPr>
-        <w:rFonts w:cs="Times New Roman" w:hint="default"/>
+        <w:rFonts w:hint="default" w:cs="Times New Roman"/>
       </w:rPr>
     </w:lvl>
     <w:lvl w:ilvl="5">
@@ -13174,7 +13319,7 @@
         <w:ind w:left="2865" w:hanging="1080"/>
       </w:pPr>
       <w:rPr>
-        <w:rFonts w:cs="Times New Roman" w:hint="default"/>
+        <w:rFonts w:hint="default" w:cs="Times New Roman"/>
       </w:rPr>
     </w:lvl>
     <w:lvl w:ilvl="6">
@@ -13189,7 +13334,7 @@
         <w:ind w:left="3582" w:hanging="1440"/>
       </w:pPr>
       <w:rPr>
-        <w:rFonts w:cs="Times New Roman" w:hint="default"/>
+        <w:rFonts w:hint="default" w:cs="Times New Roman"/>
       </w:rPr>
     </w:lvl>
     <w:lvl w:ilvl="7">
@@ -13204,7 +13349,7 @@
         <w:ind w:left="3939" w:hanging="1440"/>
       </w:pPr>
       <w:rPr>
-        <w:rFonts w:cs="Times New Roman" w:hint="default"/>
+        <w:rFonts w:hint="default" w:cs="Times New Roman"/>
       </w:rPr>
     </w:lvl>
     <w:lvl w:ilvl="8">
@@ -13219,7 +13364,7 @@
         <w:ind w:left="4656" w:hanging="1800"/>
       </w:pPr>
       <w:rPr>
-        <w:rFonts w:cs="Times New Roman" w:hint="default"/>
+        <w:rFonts w:hint="default" w:cs="Times New Roman"/>
       </w:rPr>
     </w:lvl>
   </w:abstractNum>
@@ -13239,7 +13384,7 @@
         <w:ind w:left="405" w:hanging="405"/>
       </w:pPr>
       <w:rPr>
-        <w:rFonts w:ascii="Symbol" w:hAnsi="Symbol" w:hint="default"/>
+        <w:rFonts w:hint="default" w:ascii="Symbol" w:hAnsi="Symbol"/>
       </w:rPr>
     </w:lvl>
     <w:lvl w:ilvl="1">
@@ -13492,7 +13637,7 @@
         <w:ind w:left="510" w:hanging="510"/>
       </w:pPr>
       <w:rPr>
-        <w:rFonts w:cs="Times New Roman" w:hint="default"/>
+        <w:rFonts w:hint="default" w:cs="Times New Roman"/>
       </w:rPr>
     </w:lvl>
     <w:lvl w:ilvl="1">
@@ -13507,7 +13652,7 @@
         <w:ind w:left="1077" w:hanging="720"/>
       </w:pPr>
       <w:rPr>
-        <w:rFonts w:cs="Times New Roman" w:hint="default"/>
+        <w:rFonts w:hint="default" w:cs="Times New Roman"/>
       </w:rPr>
     </w:lvl>
     <w:lvl w:ilvl="2">
@@ -13522,7 +13667,7 @@
         <w:ind w:left="1794" w:hanging="1080"/>
       </w:pPr>
       <w:rPr>
-        <w:rFonts w:cs="Times New Roman" w:hint="default"/>
+        <w:rFonts w:hint="default" w:cs="Times New Roman"/>
       </w:rPr>
     </w:lvl>
     <w:lvl w:ilvl="3">
@@ -13537,7 +13682,7 @@
         <w:ind w:left="2511" w:hanging="1440"/>
       </w:pPr>
       <w:rPr>
-        <w:rFonts w:cs="Times New Roman" w:hint="default"/>
+        <w:rFonts w:hint="default" w:cs="Times New Roman"/>
       </w:rPr>
     </w:lvl>
     <w:lvl w:ilvl="4">
@@ -13552,7 +13697,7 @@
         <w:ind w:left="3228" w:hanging="1800"/>
       </w:pPr>
       <w:rPr>
-        <w:rFonts w:cs="Times New Roman" w:hint="default"/>
+        <w:rFonts w:hint="default" w:cs="Times New Roman"/>
       </w:rPr>
     </w:lvl>
     <w:lvl w:ilvl="5">
@@ -13567,7 +13712,7 @@
         <w:ind w:left="3945" w:hanging="2160"/>
       </w:pPr>
       <w:rPr>
-        <w:rFonts w:cs="Times New Roman" w:hint="default"/>
+        <w:rFonts w:hint="default" w:cs="Times New Roman"/>
       </w:rPr>
     </w:lvl>
     <w:lvl w:ilvl="6">
@@ -13582,7 +13727,7 @@
         <w:ind w:left="4662" w:hanging="2520"/>
       </w:pPr>
       <w:rPr>
-        <w:rFonts w:cs="Times New Roman" w:hint="default"/>
+        <w:rFonts w:hint="default" w:cs="Times New Roman"/>
       </w:rPr>
     </w:lvl>
     <w:lvl w:ilvl="7">
@@ -13597,7 +13742,7 @@
         <w:ind w:left="5379" w:hanging="2880"/>
       </w:pPr>
       <w:rPr>
-        <w:rFonts w:cs="Times New Roman" w:hint="default"/>
+        <w:rFonts w:hint="default" w:cs="Times New Roman"/>
       </w:rPr>
     </w:lvl>
     <w:lvl w:ilvl="8">
@@ -13612,7 +13757,7 @@
         <w:ind w:left="6096" w:hanging="3240"/>
       </w:pPr>
       <w:rPr>
-        <w:rFonts w:cs="Times New Roman" w:hint="default"/>
+        <w:rFonts w:hint="default" w:cs="Times New Roman"/>
       </w:rPr>
     </w:lvl>
   </w:abstractNum>
@@ -13743,7 +13888,7 @@
         <w:ind w:left="720" w:hanging="360"/>
       </w:pPr>
       <w:rPr>
-        <w:rFonts w:ascii="Verdana" w:eastAsia="Times New Roman" w:hAnsi="Verdana" w:cs="Times New Roman"/>
+        <w:rFonts w:ascii="Verdana" w:hAnsi="Verdana" w:eastAsia="Times New Roman" w:cs="Times New Roman"/>
       </w:rPr>
     </w:lvl>
     <w:lvl w:ilvl="1">
@@ -14147,7 +14292,7 @@
         <w:ind w:left="420" w:hanging="420"/>
       </w:pPr>
       <w:rPr>
-        <w:rFonts w:cs="Times New Roman" w:hint="default"/>
+        <w:rFonts w:hint="default" w:cs="Times New Roman"/>
       </w:rPr>
     </w:lvl>
     <w:lvl w:ilvl="1">
@@ -14162,7 +14307,7 @@
         <w:ind w:left="1077" w:hanging="720"/>
       </w:pPr>
       <w:rPr>
-        <w:rFonts w:cs="Times New Roman" w:hint="default"/>
+        <w:rFonts w:hint="default" w:cs="Times New Roman"/>
       </w:rPr>
     </w:lvl>
     <w:lvl w:ilvl="2">
@@ -14177,7 +14322,7 @@
         <w:ind w:left="1794" w:hanging="1080"/>
       </w:pPr>
       <w:rPr>
-        <w:rFonts w:cs="Times New Roman" w:hint="default"/>
+        <w:rFonts w:hint="default" w:cs="Times New Roman"/>
       </w:rPr>
     </w:lvl>
     <w:lvl w:ilvl="3">
@@ -14192,7 +14337,7 @@
         <w:ind w:left="2511" w:hanging="1440"/>
       </w:pPr>
       <w:rPr>
-        <w:rFonts w:cs="Times New Roman" w:hint="default"/>
+        <w:rFonts w:hint="default" w:cs="Times New Roman"/>
       </w:rPr>
     </w:lvl>
     <w:lvl w:ilvl="4">
@@ -14207,7 +14352,7 @@
         <w:ind w:left="2868" w:hanging="1440"/>
       </w:pPr>
       <w:rPr>
-        <w:rFonts w:cs="Times New Roman" w:hint="default"/>
+        <w:rFonts w:hint="default" w:cs="Times New Roman"/>
       </w:rPr>
     </w:lvl>
     <w:lvl w:ilvl="5">
@@ -14222,7 +14367,7 @@
         <w:ind w:left="3585" w:hanging="1800"/>
       </w:pPr>
       <w:rPr>
-        <w:rFonts w:cs="Times New Roman" w:hint="default"/>
+        <w:rFonts w:hint="default" w:cs="Times New Roman"/>
       </w:rPr>
     </w:lvl>
     <w:lvl w:ilvl="6">
@@ -14237,7 +14382,7 @@
         <w:ind w:left="4302" w:hanging="2160"/>
       </w:pPr>
       <w:rPr>
-        <w:rFonts w:cs="Times New Roman" w:hint="default"/>
+        <w:rFonts w:hint="default" w:cs="Times New Roman"/>
       </w:rPr>
     </w:lvl>
     <w:lvl w:ilvl="7">
@@ -14252,7 +14397,7 @@
         <w:ind w:left="5019" w:hanging="2520"/>
       </w:pPr>
       <w:rPr>
-        <w:rFonts w:cs="Times New Roman" w:hint="default"/>
+        <w:rFonts w:hint="default" w:cs="Times New Roman"/>
       </w:rPr>
     </w:lvl>
     <w:lvl w:ilvl="8">
@@ -14267,7 +14412,7 @@
         <w:ind w:left="5736" w:hanging="2880"/>
       </w:pPr>
       <w:rPr>
-        <w:rFonts w:cs="Times New Roman" w:hint="default"/>
+        <w:rFonts w:hint="default" w:cs="Times New Roman"/>
       </w:rPr>
     </w:lvl>
   </w:abstractNum>
@@ -14400,7 +14545,7 @@
         <w:ind w:left="1494" w:hanging="360"/>
       </w:pPr>
       <w:rPr>
-        <w:rFonts w:ascii="Times New Roman" w:hAnsi="Times New Roman" w:hint="default"/>
+        <w:rFonts w:hint="default" w:ascii="Times New Roman" w:hAnsi="Times New Roman"/>
       </w:rPr>
     </w:lvl>
   </w:abstractNum>
@@ -14420,7 +14565,7 @@
         <w:ind w:left="420" w:hanging="420"/>
       </w:pPr>
       <w:rPr>
-        <w:rFonts w:cs="Times New Roman" w:hint="default"/>
+        <w:rFonts w:hint="default" w:cs="Times New Roman"/>
       </w:rPr>
     </w:lvl>
     <w:lvl w:ilvl="1">
@@ -14435,7 +14580,7 @@
         <w:ind w:left="1077" w:hanging="720"/>
       </w:pPr>
       <w:rPr>
-        <w:rFonts w:cs="Times New Roman" w:hint="default"/>
+        <w:rFonts w:hint="default" w:cs="Times New Roman"/>
       </w:rPr>
     </w:lvl>
     <w:lvl w:ilvl="2">
@@ -14450,7 +14595,7 @@
         <w:ind w:left="1794" w:hanging="1080"/>
       </w:pPr>
       <w:rPr>
-        <w:rFonts w:cs="Times New Roman" w:hint="default"/>
+        <w:rFonts w:hint="default" w:cs="Times New Roman"/>
       </w:rPr>
     </w:lvl>
     <w:lvl w:ilvl="3">
@@ -14465,7 +14610,7 @@
         <w:ind w:left="2511" w:hanging="1440"/>
       </w:pPr>
       <w:rPr>
-        <w:rFonts w:cs="Times New Roman" w:hint="default"/>
+        <w:rFonts w:hint="default" w:cs="Times New Roman"/>
       </w:rPr>
     </w:lvl>
     <w:lvl w:ilvl="4">
@@ -14480,7 +14625,7 @@
         <w:ind w:left="2868" w:hanging="1440"/>
       </w:pPr>
       <w:rPr>
-        <w:rFonts w:cs="Times New Roman" w:hint="default"/>
+        <w:rFonts w:hint="default" w:cs="Times New Roman"/>
       </w:rPr>
     </w:lvl>
     <w:lvl w:ilvl="5">
@@ -14495,7 +14640,7 @@
         <w:ind w:left="3585" w:hanging="1800"/>
       </w:pPr>
       <w:rPr>
-        <w:rFonts w:cs="Times New Roman" w:hint="default"/>
+        <w:rFonts w:hint="default" w:cs="Times New Roman"/>
       </w:rPr>
     </w:lvl>
     <w:lvl w:ilvl="6">
@@ -14510,7 +14655,7 @@
         <w:ind w:left="4302" w:hanging="2160"/>
       </w:pPr>
       <w:rPr>
-        <w:rFonts w:cs="Times New Roman" w:hint="default"/>
+        <w:rFonts w:hint="default" w:cs="Times New Roman"/>
       </w:rPr>
     </w:lvl>
     <w:lvl w:ilvl="7">
@@ -14526,7 +14671,7 @@
         <w:ind w:left="5019" w:hanging="2520"/>
       </w:pPr>
       <w:rPr>
-        <w:rFonts w:cs="Times New Roman" w:hint="default"/>
+        <w:rFonts w:hint="default" w:cs="Times New Roman"/>
       </w:rPr>
     </w:lvl>
     <w:lvl w:ilvl="8">
@@ -14542,7 +14687,7 @@
         <w:ind w:left="5736" w:hanging="2880"/>
       </w:pPr>
       <w:rPr>
-        <w:rFonts w:cs="Times New Roman" w:hint="default"/>
+        <w:rFonts w:hint="default" w:cs="Times New Roman"/>
       </w:rPr>
     </w:lvl>
   </w:abstractNum>
@@ -14559,7 +14704,7 @@
         <w:ind w:left="720" w:hanging="360"/>
       </w:pPr>
       <w:rPr>
-        <w:rFonts w:ascii="Verdana" w:eastAsia="Calibri" w:hAnsi="Verdana" w:cs="Times New Roman" w:hint="default"/>
+        <w:rFonts w:hint="default" w:ascii="Verdana" w:hAnsi="Verdana" w:eastAsia="Calibri" w:cs="Times New Roman"/>
       </w:rPr>
     </w:lvl>
     <w:lvl w:ilvl="1" w:tplc="040B0003" w:tentative="1">
@@ -14571,7 +14716,7 @@
         <w:ind w:left="1440" w:hanging="360"/>
       </w:pPr>
       <w:rPr>
-        <w:rFonts w:ascii="Courier New" w:hAnsi="Courier New" w:cs="Courier New" w:hint="default"/>
+        <w:rFonts w:hint="default" w:ascii="Courier New" w:hAnsi="Courier New" w:cs="Courier New"/>
       </w:rPr>
     </w:lvl>
     <w:lvl w:ilvl="2" w:tplc="040B0005" w:tentative="1">
@@ -14583,7 +14728,7 @@
         <w:ind w:left="2160" w:hanging="360"/>
       </w:pPr>
       <w:rPr>
-        <w:rFonts w:ascii="Wingdings" w:hAnsi="Wingdings" w:hint="default"/>
+        <w:rFonts w:hint="default" w:ascii="Wingdings" w:hAnsi="Wingdings"/>
       </w:rPr>
     </w:lvl>
     <w:lvl w:ilvl="3" w:tplc="040B0001" w:tentative="1">
@@ -14595,7 +14740,7 @@
         <w:ind w:left="2880" w:hanging="360"/>
       </w:pPr>
       <w:rPr>
-        <w:rFonts w:ascii="Symbol" w:hAnsi="Symbol" w:hint="default"/>
+        <w:rFonts w:hint="default" w:ascii="Symbol" w:hAnsi="Symbol"/>
       </w:rPr>
     </w:lvl>
     <w:lvl w:ilvl="4" w:tplc="040B0003" w:tentative="1">
@@ -14607,7 +14752,7 @@
         <w:ind w:left="3600" w:hanging="360"/>
       </w:pPr>
       <w:rPr>
-        <w:rFonts w:ascii="Courier New" w:hAnsi="Courier New" w:cs="Courier New" w:hint="default"/>
+        <w:rFonts w:hint="default" w:ascii="Courier New" w:hAnsi="Courier New" w:cs="Courier New"/>
       </w:rPr>
     </w:lvl>
     <w:lvl w:ilvl="5" w:tplc="040B0005" w:tentative="1">
@@ -14619,7 +14764,7 @@
         <w:ind w:left="4320" w:hanging="360"/>
       </w:pPr>
       <w:rPr>
-        <w:rFonts w:ascii="Wingdings" w:hAnsi="Wingdings" w:hint="default"/>
+        <w:rFonts w:hint="default" w:ascii="Wingdings" w:hAnsi="Wingdings"/>
       </w:rPr>
     </w:lvl>
     <w:lvl w:ilvl="6" w:tplc="040B0001" w:tentative="1">
@@ -14631,7 +14776,7 @@
         <w:ind w:left="5040" w:hanging="360"/>
       </w:pPr>
       <w:rPr>
-        <w:rFonts w:ascii="Symbol" w:hAnsi="Symbol" w:hint="default"/>
+        <w:rFonts w:hint="default" w:ascii="Symbol" w:hAnsi="Symbol"/>
       </w:rPr>
     </w:lvl>
     <w:lvl w:ilvl="7" w:tplc="040B0003" w:tentative="1">
@@ -14643,7 +14788,7 @@
         <w:ind w:left="5760" w:hanging="360"/>
       </w:pPr>
       <w:rPr>
-        <w:rFonts w:ascii="Courier New" w:hAnsi="Courier New" w:cs="Courier New" w:hint="default"/>
+        <w:rFonts w:hint="default" w:ascii="Courier New" w:hAnsi="Courier New" w:cs="Courier New"/>
       </w:rPr>
     </w:lvl>
     <w:lvl w:ilvl="8" w:tplc="040B0005" w:tentative="1">
@@ -14655,7 +14800,7 @@
         <w:ind w:left="6480" w:hanging="360"/>
       </w:pPr>
       <w:rPr>
-        <w:rFonts w:ascii="Wingdings" w:hAnsi="Wingdings" w:hint="default"/>
+        <w:rFonts w:hint="default" w:ascii="Wingdings" w:hAnsi="Wingdings"/>
       </w:rPr>
     </w:lvl>
   </w:abstractNum>
@@ -14671,7 +14816,7 @@
         <w:ind w:left="720" w:hanging="360"/>
       </w:pPr>
       <w:rPr>
-        <w:rFonts w:ascii="Calibri" w:eastAsiaTheme="minorHAnsi" w:hAnsi="Calibri" w:cs="Calibri" w:hint="default"/>
+        <w:rFonts w:hint="default" w:ascii="Calibri" w:hAnsi="Calibri" w:cs="Calibri" w:eastAsiaTheme="minorHAnsi"/>
       </w:rPr>
     </w:lvl>
     <w:lvl w:ilvl="1" w:tplc="10000003" w:tentative="1">
@@ -14683,7 +14828,7 @@
         <w:ind w:left="1440" w:hanging="360"/>
       </w:pPr>
       <w:rPr>
-        <w:rFonts w:ascii="Courier New" w:hAnsi="Courier New" w:cs="Courier New" w:hint="default"/>
+        <w:rFonts w:hint="default" w:ascii="Courier New" w:hAnsi="Courier New" w:cs="Courier New"/>
       </w:rPr>
     </w:lvl>
     <w:lvl w:ilvl="2" w:tplc="10000005" w:tentative="1">
@@ -14695,7 +14840,7 @@
         <w:ind w:left="2160" w:hanging="360"/>
       </w:pPr>
       <w:rPr>
-        <w:rFonts w:ascii="Wingdings" w:hAnsi="Wingdings" w:hint="default"/>
+        <w:rFonts w:hint="default" w:ascii="Wingdings" w:hAnsi="Wingdings"/>
       </w:rPr>
     </w:lvl>
     <w:lvl w:ilvl="3" w:tplc="10000001" w:tentative="1">
@@ -14707,7 +14852,7 @@
         <w:ind w:left="2880" w:hanging="360"/>
       </w:pPr>
       <w:rPr>
-        <w:rFonts w:ascii="Symbol" w:hAnsi="Symbol" w:hint="default"/>
+        <w:rFonts w:hint="default" w:ascii="Symbol" w:hAnsi="Symbol"/>
       </w:rPr>
     </w:lvl>
     <w:lvl w:ilvl="4" w:tplc="10000003" w:tentative="1">
@@ -14719,7 +14864,7 @@
         <w:ind w:left="3600" w:hanging="360"/>
       </w:pPr>
       <w:rPr>
-        <w:rFonts w:ascii="Courier New" w:hAnsi="Courier New" w:cs="Courier New" w:hint="default"/>
+        <w:rFonts w:hint="default" w:ascii="Courier New" w:hAnsi="Courier New" w:cs="Courier New"/>
       </w:rPr>
     </w:lvl>
     <w:lvl w:ilvl="5" w:tplc="10000005" w:tentative="1">
@@ -14731,7 +14876,7 @@
         <w:ind w:left="4320" w:hanging="360"/>
       </w:pPr>
       <w:rPr>
-        <w:rFonts w:ascii="Wingdings" w:hAnsi="Wingdings" w:hint="default"/>
+        <w:rFonts w:hint="default" w:ascii="Wingdings" w:hAnsi="Wingdings"/>
       </w:rPr>
     </w:lvl>
     <w:lvl w:ilvl="6" w:tplc="10000001" w:tentative="1">
@@ -14743,7 +14888,7 @@
         <w:ind w:left="5040" w:hanging="360"/>
       </w:pPr>
       <w:rPr>
-        <w:rFonts w:ascii="Symbol" w:hAnsi="Symbol" w:hint="default"/>
+        <w:rFonts w:hint="default" w:ascii="Symbol" w:hAnsi="Symbol"/>
       </w:rPr>
     </w:lvl>
     <w:lvl w:ilvl="7" w:tplc="10000003" w:tentative="1">
@@ -14755,7 +14900,7 @@
         <w:ind w:left="5760" w:hanging="360"/>
       </w:pPr>
       <w:rPr>
-        <w:rFonts w:ascii="Courier New" w:hAnsi="Courier New" w:cs="Courier New" w:hint="default"/>
+        <w:rFonts w:hint="default" w:ascii="Courier New" w:hAnsi="Courier New" w:cs="Courier New"/>
       </w:rPr>
     </w:lvl>
     <w:lvl w:ilvl="8" w:tplc="10000005" w:tentative="1">
@@ -14767,7 +14912,7 @@
         <w:ind w:left="6480" w:hanging="360"/>
       </w:pPr>
       <w:rPr>
-        <w:rFonts w:ascii="Wingdings" w:hAnsi="Wingdings" w:hint="default"/>
+        <w:rFonts w:hint="default" w:ascii="Wingdings" w:hAnsi="Wingdings"/>
       </w:rPr>
     </w:lvl>
   </w:abstractNum>
@@ -14900,7 +15045,7 @@
         <w:ind w:left="405" w:hanging="405"/>
       </w:pPr>
       <w:rPr>
-        <w:rFonts w:cs="Times New Roman" w:hint="default"/>
+        <w:rFonts w:hint="default" w:cs="Times New Roman"/>
       </w:rPr>
     </w:lvl>
     <w:lvl w:ilvl="1">
@@ -15240,7 +15385,7 @@
         <w:ind w:left="510" w:hanging="510"/>
       </w:pPr>
       <w:rPr>
-        <w:rFonts w:cs="Times New Roman" w:hint="default"/>
+        <w:rFonts w:hint="default" w:cs="Times New Roman"/>
       </w:rPr>
     </w:lvl>
     <w:lvl w:ilvl="1">
@@ -15255,7 +15400,7 @@
         <w:ind w:left="1077" w:hanging="720"/>
       </w:pPr>
       <w:rPr>
-        <w:rFonts w:cs="Times New Roman" w:hint="default"/>
+        <w:rFonts w:hint="default" w:cs="Times New Roman"/>
       </w:rPr>
     </w:lvl>
     <w:lvl w:ilvl="2">
@@ -15270,7 +15415,7 @@
         <w:ind w:left="1794" w:hanging="1080"/>
       </w:pPr>
       <w:rPr>
-        <w:rFonts w:cs="Times New Roman" w:hint="default"/>
+        <w:rFonts w:hint="default" w:cs="Times New Roman"/>
       </w:rPr>
     </w:lvl>
     <w:lvl w:ilvl="3">
@@ -15285,7 +15430,7 @@
         <w:ind w:left="2511" w:hanging="1440"/>
       </w:pPr>
       <w:rPr>
-        <w:rFonts w:cs="Times New Roman" w:hint="default"/>
+        <w:rFonts w:hint="default" w:cs="Times New Roman"/>
       </w:rPr>
     </w:lvl>
     <w:lvl w:ilvl="4">
@@ -15300,7 +15445,7 @@
         <w:ind w:left="3228" w:hanging="1800"/>
       </w:pPr>
       <w:rPr>
-        <w:rFonts w:cs="Times New Roman" w:hint="default"/>
+        <w:rFonts w:hint="default" w:cs="Times New Roman"/>
       </w:rPr>
     </w:lvl>
     <w:lvl w:ilvl="5">
@@ -15315,7 +15460,7 @@
         <w:ind w:left="3945" w:hanging="2160"/>
       </w:pPr>
       <w:rPr>
-        <w:rFonts w:cs="Times New Roman" w:hint="default"/>
+        <w:rFonts w:hint="default" w:cs="Times New Roman"/>
       </w:rPr>
     </w:lvl>
     <w:lvl w:ilvl="6">
@@ -15330,7 +15475,7 @@
         <w:ind w:left="4662" w:hanging="2520"/>
       </w:pPr>
       <w:rPr>
-        <w:rFonts w:cs="Times New Roman" w:hint="default"/>
+        <w:rFonts w:hint="default" w:cs="Times New Roman"/>
       </w:rPr>
     </w:lvl>
     <w:lvl w:ilvl="7">
@@ -15345,7 +15490,7 @@
         <w:ind w:left="5379" w:hanging="2880"/>
       </w:pPr>
       <w:rPr>
-        <w:rFonts w:cs="Times New Roman" w:hint="default"/>
+        <w:rFonts w:hint="default" w:cs="Times New Roman"/>
       </w:rPr>
     </w:lvl>
     <w:lvl w:ilvl="8">
@@ -15360,7 +15505,7 @@
         <w:ind w:left="6096" w:hanging="3240"/>
       </w:pPr>
       <w:rPr>
-        <w:rFonts w:cs="Times New Roman" w:hint="default"/>
+        <w:rFonts w:hint="default" w:cs="Times New Roman"/>
       </w:rPr>
     </w:lvl>
   </w:abstractNum>
@@ -15380,7 +15525,7 @@
         <w:ind w:left="510" w:hanging="510"/>
       </w:pPr>
       <w:rPr>
-        <w:rFonts w:cs="Times New Roman" w:hint="default"/>
+        <w:rFonts w:hint="default" w:cs="Times New Roman"/>
       </w:rPr>
     </w:lvl>
     <w:lvl w:ilvl="1">
@@ -15395,7 +15540,7 @@
         <w:ind w:left="1077" w:hanging="720"/>
       </w:pPr>
       <w:rPr>
-        <w:rFonts w:cs="Times New Roman" w:hint="default"/>
+        <w:rFonts w:hint="default" w:cs="Times New Roman"/>
       </w:rPr>
     </w:lvl>
     <w:lvl w:ilvl="2">
@@ -15410,7 +15555,7 @@
         <w:ind w:left="1794" w:hanging="1080"/>
       </w:pPr>
       <w:rPr>
-        <w:rFonts w:cs="Times New Roman" w:hint="default"/>
+        <w:rFonts w:hint="default" w:cs="Times New Roman"/>
       </w:rPr>
     </w:lvl>
     <w:lvl w:ilvl="3">
@@ -15425,7 +15570,7 @@
         <w:ind w:left="2511" w:hanging="1440"/>
       </w:pPr>
       <w:rPr>
-        <w:rFonts w:cs="Times New Roman" w:hint="default"/>
+        <w:rFonts w:hint="default" w:cs="Times New Roman"/>
       </w:rPr>
     </w:lvl>
     <w:lvl w:ilvl="4">
@@ -15440,7 +15585,7 @@
         <w:ind w:left="3228" w:hanging="1800"/>
       </w:pPr>
       <w:rPr>
-        <w:rFonts w:cs="Times New Roman" w:hint="default"/>
+        <w:rFonts w:hint="default" w:cs="Times New Roman"/>
       </w:rPr>
     </w:lvl>
     <w:lvl w:ilvl="5">
@@ -15455,7 +15600,7 @@
         <w:ind w:left="3945" w:hanging="2160"/>
       </w:pPr>
       <w:rPr>
-        <w:rFonts w:cs="Times New Roman" w:hint="default"/>
+        <w:rFonts w:hint="default" w:cs="Times New Roman"/>
       </w:rPr>
     </w:lvl>
     <w:lvl w:ilvl="6">
@@ -15470,7 +15615,7 @@
         <w:ind w:left="4662" w:hanging="2520"/>
       </w:pPr>
       <w:rPr>
-        <w:rFonts w:cs="Times New Roman" w:hint="default"/>
+        <w:rFonts w:hint="default" w:cs="Times New Roman"/>
       </w:rPr>
     </w:lvl>
     <w:lvl w:ilvl="7">
@@ -15485,7 +15630,7 @@
         <w:ind w:left="5379" w:hanging="2880"/>
       </w:pPr>
       <w:rPr>
-        <w:rFonts w:cs="Times New Roman" w:hint="default"/>
+        <w:rFonts w:hint="default" w:cs="Times New Roman"/>
       </w:rPr>
     </w:lvl>
     <w:lvl w:ilvl="8">
@@ -15500,7 +15645,7 @@
         <w:ind w:left="6096" w:hanging="3240"/>
       </w:pPr>
       <w:rPr>
-        <w:rFonts w:cs="Times New Roman" w:hint="default"/>
+        <w:rFonts w:hint="default" w:cs="Times New Roman"/>
       </w:rPr>
     </w:lvl>
   </w:abstractNum>
@@ -15604,11 +15749,11 @@
 </file>
 
 <file path=word/styles.xml><?xml version="1.0" encoding="utf-8"?>
-<w:styles xmlns:mc="http://schemas.openxmlformats.org/markup-compatibility/2006" xmlns:r="http://schemas.openxmlformats.org/officeDocument/2006/relationships" xmlns:w="http://schemas.openxmlformats.org/wordprocessingml/2006/main" xmlns:w14="http://schemas.microsoft.com/office/word/2010/wordml" xmlns:w15="http://schemas.microsoft.com/office/word/2012/wordml" xmlns:w16cex="http://schemas.microsoft.com/office/word/2018/wordml/cex" xmlns:w16cid="http://schemas.microsoft.com/office/word/2016/wordml/cid" xmlns:w16="http://schemas.microsoft.com/office/word/2018/wordml" xmlns:w16du="http://schemas.microsoft.com/office/word/2023/wordml/word16du" xmlns:w16sdtdh="http://schemas.microsoft.com/office/word/2020/wordml/sdtdatahash" xmlns:w16sdtfl="http://schemas.microsoft.com/office/word/2024/wordml/sdtformatlock" xmlns:w16se="http://schemas.microsoft.com/office/word/2015/wordml/symex" mc:Ignorable="w14 w15 w16se w16cid w16 w16cex w16sdtdh w16sdtfl w16du">
+<w:styles xmlns:wp14="http://schemas.microsoft.com/office/word/2010/wordprocessingDrawing" xmlns:mc="http://schemas.openxmlformats.org/markup-compatibility/2006" xmlns:r="http://schemas.openxmlformats.org/officeDocument/2006/relationships" xmlns:w="http://schemas.openxmlformats.org/wordprocessingml/2006/main" xmlns:w14="http://schemas.microsoft.com/office/word/2010/wordml" xmlns:w15="http://schemas.microsoft.com/office/word/2012/wordml" xmlns:w16cex="http://schemas.microsoft.com/office/word/2018/wordml/cex" xmlns:w16cid="http://schemas.microsoft.com/office/word/2016/wordml/cid" xmlns:w16="http://schemas.microsoft.com/office/word/2018/wordml" xmlns:w16du="http://schemas.microsoft.com/office/word/2023/wordml/word16du" xmlns:w16sdtdh="http://schemas.microsoft.com/office/word/2020/wordml/sdtdatahash" xmlns:w16sdtfl="http://schemas.microsoft.com/office/word/2024/wordml/sdtformatlock" xmlns:w16se="http://schemas.microsoft.com/office/word/2015/wordml/symex" mc:Ignorable="w14 w15 w16se w16cid w16 w16cex w16sdtdh w16sdtfl w16du wp14">
   <w:docDefaults>
     <w:rPrDefault>
       <w:rPr>
-        <w:rFonts w:ascii="Times New Roman" w:eastAsia="Times New Roman" w:hAnsi="Times New Roman" w:cs="Times New Roman"/>
+        <w:rFonts w:ascii="Times New Roman" w:hAnsi="Times New Roman" w:eastAsia="Times New Roman" w:cs="Times New Roman"/>
         <w:lang w:val="fi-FI" w:eastAsia="fi-FI" w:bidi="ar-SA"/>
       </w:rPr>
     </w:rPrDefault>
@@ -15634,22 +15779,22 @@
     <w:lsdException w:name="index 7" w:semiHidden="1" w:unhideWhenUsed="1"/>
     <w:lsdException w:name="index 8" w:semiHidden="1" w:unhideWhenUsed="1"/>
     <w:lsdException w:name="index 9" w:semiHidden="1" w:unhideWhenUsed="1"/>
-    <w:lsdException w:name="toc 1" w:semiHidden="1" w:uiPriority="39" w:unhideWhenUsed="1"/>
-    <w:lsdException w:name="toc 2" w:semiHidden="1" w:uiPriority="39" w:unhideWhenUsed="1"/>
-    <w:lsdException w:name="toc 3" w:semiHidden="1" w:uiPriority="39" w:unhideWhenUsed="1"/>
-    <w:lsdException w:name="toc 4" w:semiHidden="1" w:uiPriority="39" w:unhideWhenUsed="1"/>
-    <w:lsdException w:name="toc 5" w:semiHidden="1" w:uiPriority="39" w:unhideWhenUsed="1"/>
-    <w:lsdException w:name="toc 6" w:semiHidden="1" w:uiPriority="39" w:unhideWhenUsed="1"/>
-    <w:lsdException w:name="toc 7" w:semiHidden="1" w:uiPriority="39" w:unhideWhenUsed="1"/>
-    <w:lsdException w:name="toc 8" w:semiHidden="1" w:uiPriority="39" w:unhideWhenUsed="1"/>
-    <w:lsdException w:name="toc 9" w:semiHidden="1" w:uiPriority="39" w:unhideWhenUsed="1"/>
+    <w:lsdException w:name="toc 1" w:uiPriority="39" w:semiHidden="1" w:unhideWhenUsed="1"/>
+    <w:lsdException w:name="toc 2" w:uiPriority="39" w:semiHidden="1" w:unhideWhenUsed="1"/>
+    <w:lsdException w:name="toc 3" w:uiPriority="39" w:semiHidden="1" w:unhideWhenUsed="1"/>
+    <w:lsdException w:name="toc 4" w:uiPriority="39" w:semiHidden="1" w:unhideWhenUsed="1"/>
+    <w:lsdException w:name="toc 5" w:uiPriority="39" w:semiHidden="1" w:unhideWhenUsed="1"/>
+    <w:lsdException w:name="toc 6" w:uiPriority="39" w:semiHidden="1" w:unhideWhenUsed="1"/>
+    <w:lsdException w:name="toc 7" w:uiPriority="39" w:semiHidden="1" w:unhideWhenUsed="1"/>
+    <w:lsdException w:name="toc 8" w:uiPriority="39" w:semiHidden="1" w:unhideWhenUsed="1"/>
+    <w:lsdException w:name="toc 9" w:uiPriority="39" w:semiHidden="1" w:unhideWhenUsed="1"/>
     <w:lsdException w:name="Normal Indent" w:semiHidden="1" w:unhideWhenUsed="1"/>
     <w:lsdException w:name="footnote text" w:semiHidden="1" w:unhideWhenUsed="1"/>
     <w:lsdException w:name="annotation text" w:semiHidden="1" w:unhideWhenUsed="1"/>
     <w:lsdException w:name="header" w:semiHidden="1" w:unhideWhenUsed="1"/>
     <w:lsdException w:name="footer" w:semiHidden="1" w:unhideWhenUsed="1"/>
     <w:lsdException w:name="index heading" w:semiHidden="1" w:unhideWhenUsed="1"/>
-    <w:lsdException w:name="caption" w:semiHidden="1" w:uiPriority="35" w:unhideWhenUsed="1" w:qFormat="1"/>
+    <w:lsdException w:name="caption" w:uiPriority="35" w:semiHidden="1" w:unhideWhenUsed="1" w:qFormat="1"/>
     <w:lsdException w:name="table of figures" w:semiHidden="1" w:unhideWhenUsed="1"/>
     <w:lsdException w:name="envelope address" w:semiHidden="1" w:unhideWhenUsed="1"/>
     <w:lsdException w:name="envelope return" w:semiHidden="1" w:unhideWhenUsed="1"/>
@@ -15680,7 +15825,7 @@
     <w:lsdException w:name="Title" w:uiPriority="10" w:qFormat="1"/>
     <w:lsdException w:name="Closing" w:semiHidden="1" w:unhideWhenUsed="1"/>
     <w:lsdException w:name="Signature" w:semiHidden="1" w:unhideWhenUsed="1"/>
-    <w:lsdException w:name="Default Paragraph Font" w:semiHidden="1" w:uiPriority="1" w:unhideWhenUsed="1"/>
+    <w:lsdException w:name="Default Paragraph Font" w:uiPriority="1" w:semiHidden="1" w:unhideWhenUsed="1"/>
     <w:lsdException w:name="Body Text" w:semiHidden="1" w:unhideWhenUsed="1"/>
     <w:lsdException w:name="Body Text Indent" w:semiHidden="1" w:unhideWhenUsed="1"/>
     <w:lsdException w:name="List Continue" w:semiHidden="1" w:unhideWhenUsed="1"/>
@@ -15880,8 +16025,8 @@
     <w:lsdException w:name="Subtle Reference" w:uiPriority="31" w:qFormat="1"/>
     <w:lsdException w:name="Intense Reference" w:uiPriority="32" w:qFormat="1"/>
     <w:lsdException w:name="Book Title" w:uiPriority="33" w:qFormat="1"/>
-    <w:lsdException w:name="Bibliography" w:semiHidden="1" w:uiPriority="37" w:unhideWhenUsed="1"/>
-    <w:lsdException w:name="TOC Heading" w:semiHidden="1" w:uiPriority="39" w:unhideWhenUsed="1" w:qFormat="1"/>
+    <w:lsdException w:name="Bibliography" w:uiPriority="37" w:semiHidden="1" w:unhideWhenUsed="1"/>
+    <w:lsdException w:name="TOC Heading" w:uiPriority="39" w:semiHidden="1" w:unhideWhenUsed="1" w:qFormat="1"/>
     <w:lsdException w:name="Plain Table 1" w:uiPriority="41"/>
     <w:lsdException w:name="Plain Table 2" w:uiPriority="42"/>
     <w:lsdException w:name="Plain Table 3" w:uiPriority="43"/>
@@ -15992,7 +16137,7 @@
     <w:lsdException w:name="Unresolved Mention" w:semiHidden="1" w:unhideWhenUsed="1"/>
     <w:lsdException w:name="Smart Link" w:semiHidden="1" w:unhideWhenUsed="1"/>
   </w:latentStyles>
-  <w:style w:type="paragraph" w:default="1" w:styleId="Normaali">
+  <w:style w:type="paragraph" w:styleId="Normaali" w:default="1">
     <w:name w:val="Normal"/>
     <w:qFormat/>
     <w:pPr>
@@ -16203,13 +16348,13 @@
       <w:lang w:val="en-AU"/>
     </w:rPr>
   </w:style>
-  <w:style w:type="character" w:default="1" w:styleId="Kappaleenoletusfontti">
+  <w:style w:type="character" w:styleId="Kappaleenoletusfontti" w:default="1">
     <w:name w:val="Default Paragraph Font"/>
     <w:uiPriority w:val="1"/>
     <w:semiHidden/>
     <w:unhideWhenUsed/>
   </w:style>
-  <w:style w:type="table" w:default="1" w:styleId="Normaalitaulukko">
+  <w:style w:type="table" w:styleId="Normaalitaulukko" w:default="1">
     <w:name w:val="Normal Table"/>
     <w:uiPriority w:val="99"/>
     <w:semiHidden/>
@@ -16224,19 +16369,19 @@
       </w:tblCellMar>
     </w:tblPr>
   </w:style>
-  <w:style w:type="numbering" w:default="1" w:styleId="Eiluetteloa">
+  <w:style w:type="numbering" w:styleId="Eiluetteloa" w:default="1">
     <w:name w:val="No List"/>
     <w:uiPriority w:val="99"/>
     <w:semiHidden/>
     <w:unhideWhenUsed/>
   </w:style>
-  <w:style w:type="character" w:customStyle="1" w:styleId="Otsikko1Char">
+  <w:style w:type="character" w:styleId="Otsikko1Char" w:customStyle="1">
     <w:name w:val="Otsikko 1 Char"/>
     <w:link w:val="Otsikko1"/>
     <w:uiPriority w:val="99"/>
     <w:locked/>
     <w:rPr>
-      <w:rFonts w:ascii="Cambria" w:eastAsia="Times New Roman" w:hAnsi="Cambria" w:cs="Times New Roman"/>
+      <w:rFonts w:ascii="Cambria" w:hAnsi="Cambria" w:eastAsia="Times New Roman" w:cs="Times New Roman"/>
       <w:b/>
       <w:bCs/>
       <w:kern w:val="32"/>
@@ -16245,13 +16390,13 @@
       <w:lang w:val="fi-FI" w:eastAsia="x-none"/>
     </w:rPr>
   </w:style>
-  <w:style w:type="character" w:customStyle="1" w:styleId="Otsikko2Char">
+  <w:style w:type="character" w:styleId="Otsikko2Char" w:customStyle="1">
     <w:name w:val="Otsikko 2 Char"/>
     <w:link w:val="Otsikko2"/>
     <w:uiPriority w:val="99"/>
     <w:locked/>
     <w:rPr>
-      <w:rFonts w:ascii="Cambria" w:eastAsia="Times New Roman" w:hAnsi="Cambria" w:cs="Times New Roman"/>
+      <w:rFonts w:ascii="Cambria" w:hAnsi="Cambria" w:eastAsia="Times New Roman" w:cs="Times New Roman"/>
       <w:b/>
       <w:bCs/>
       <w:i/>
@@ -16261,14 +16406,14 @@
       <w:lang w:val="fi-FI" w:eastAsia="x-none"/>
     </w:rPr>
   </w:style>
-  <w:style w:type="character" w:customStyle="1" w:styleId="Otsikko3Char">
+  <w:style w:type="character" w:styleId="Otsikko3Char" w:customStyle="1">
     <w:name w:val="Otsikko 3 Char"/>
     <w:link w:val="Otsikko3"/>
     <w:uiPriority w:val="9"/>
     <w:semiHidden/>
     <w:locked/>
     <w:rPr>
-      <w:rFonts w:ascii="Cambria" w:eastAsia="Times New Roman" w:hAnsi="Cambria" w:cs="Times New Roman"/>
+      <w:rFonts w:ascii="Cambria" w:hAnsi="Cambria" w:eastAsia="Times New Roman" w:cs="Times New Roman"/>
       <w:b/>
       <w:bCs/>
       <w:sz w:val="26"/>
@@ -16276,14 +16421,14 @@
       <w:lang w:val="fi-FI" w:eastAsia="x-none"/>
     </w:rPr>
   </w:style>
-  <w:style w:type="character" w:customStyle="1" w:styleId="Otsikko4Char">
+  <w:style w:type="character" w:styleId="Otsikko4Char" w:customStyle="1">
     <w:name w:val="Otsikko 4 Char"/>
     <w:link w:val="Otsikko4"/>
     <w:uiPriority w:val="9"/>
     <w:semiHidden/>
     <w:locked/>
     <w:rPr>
-      <w:rFonts w:ascii="Calibri" w:eastAsia="Times New Roman" w:hAnsi="Calibri" w:cs="Times New Roman"/>
+      <w:rFonts w:ascii="Calibri" w:hAnsi="Calibri" w:eastAsia="Times New Roman" w:cs="Times New Roman"/>
       <w:b/>
       <w:bCs/>
       <w:sz w:val="28"/>
@@ -16291,14 +16436,14 @@
       <w:lang w:val="fi-FI" w:eastAsia="x-none"/>
     </w:rPr>
   </w:style>
-  <w:style w:type="character" w:customStyle="1" w:styleId="Otsikko5Char">
+  <w:style w:type="character" w:styleId="Otsikko5Char" w:customStyle="1">
     <w:name w:val="Otsikko 5 Char"/>
     <w:link w:val="Otsikko5"/>
     <w:uiPriority w:val="9"/>
     <w:semiHidden/>
     <w:locked/>
     <w:rPr>
-      <w:rFonts w:ascii="Calibri" w:eastAsia="Times New Roman" w:hAnsi="Calibri" w:cs="Times New Roman"/>
+      <w:rFonts w:ascii="Calibri" w:hAnsi="Calibri" w:eastAsia="Times New Roman" w:cs="Times New Roman"/>
       <w:b/>
       <w:bCs/>
       <w:i/>
@@ -16308,40 +16453,40 @@
       <w:lang w:val="fi-FI" w:eastAsia="x-none"/>
     </w:rPr>
   </w:style>
-  <w:style w:type="character" w:customStyle="1" w:styleId="Otsikko6Char">
+  <w:style w:type="character" w:styleId="Otsikko6Char" w:customStyle="1">
     <w:name w:val="Otsikko 6 Char"/>
     <w:link w:val="Otsikko6"/>
     <w:uiPriority w:val="9"/>
     <w:semiHidden/>
     <w:locked/>
     <w:rPr>
-      <w:rFonts w:ascii="Calibri" w:eastAsia="Times New Roman" w:hAnsi="Calibri" w:cs="Times New Roman"/>
+      <w:rFonts w:ascii="Calibri" w:hAnsi="Calibri" w:eastAsia="Times New Roman" w:cs="Times New Roman"/>
       <w:b/>
       <w:bCs/>
       <w:lang w:val="fi-FI" w:eastAsia="x-none"/>
     </w:rPr>
   </w:style>
-  <w:style w:type="character" w:customStyle="1" w:styleId="Otsikko7Char">
+  <w:style w:type="character" w:styleId="Otsikko7Char" w:customStyle="1">
     <w:name w:val="Otsikko 7 Char"/>
     <w:link w:val="Otsikko7"/>
     <w:uiPriority w:val="9"/>
     <w:semiHidden/>
     <w:locked/>
     <w:rPr>
-      <w:rFonts w:ascii="Calibri" w:eastAsia="Times New Roman" w:hAnsi="Calibri" w:cs="Times New Roman"/>
+      <w:rFonts w:ascii="Calibri" w:hAnsi="Calibri" w:eastAsia="Times New Roman" w:cs="Times New Roman"/>
       <w:sz w:val="24"/>
       <w:szCs w:val="24"/>
       <w:lang w:val="fi-FI" w:eastAsia="x-none"/>
     </w:rPr>
   </w:style>
-  <w:style w:type="character" w:customStyle="1" w:styleId="Otsikko8Char">
+  <w:style w:type="character" w:styleId="Otsikko8Char" w:customStyle="1">
     <w:name w:val="Otsikko 8 Char"/>
     <w:link w:val="Otsikko8"/>
     <w:uiPriority w:val="9"/>
     <w:semiHidden/>
     <w:locked/>
     <w:rPr>
-      <w:rFonts w:ascii="Calibri" w:eastAsia="Times New Roman" w:hAnsi="Calibri" w:cs="Times New Roman"/>
+      <w:rFonts w:ascii="Calibri" w:hAnsi="Calibri" w:eastAsia="Times New Roman" w:cs="Times New Roman"/>
       <w:i/>
       <w:iCs/>
       <w:sz w:val="24"/>
@@ -16349,14 +16494,14 @@
       <w:lang w:val="fi-FI" w:eastAsia="x-none"/>
     </w:rPr>
   </w:style>
-  <w:style w:type="character" w:customStyle="1" w:styleId="Otsikko9Char">
+  <w:style w:type="character" w:styleId="Otsikko9Char" w:customStyle="1">
     <w:name w:val="Otsikko 9 Char"/>
     <w:link w:val="Otsikko9"/>
     <w:uiPriority w:val="9"/>
     <w:semiHidden/>
     <w:locked/>
     <w:rPr>
-      <w:rFonts w:ascii="Cambria" w:eastAsia="Times New Roman" w:hAnsi="Cambria" w:cs="Times New Roman"/>
+      <w:rFonts w:ascii="Cambria" w:hAnsi="Cambria" w:eastAsia="Times New Roman" w:cs="Times New Roman"/>
       <w:lang w:val="fi-FI" w:eastAsia="x-none"/>
     </w:rPr>
   </w:style>
@@ -16372,7 +16517,7 @@
       </w:tabs>
     </w:pPr>
   </w:style>
-  <w:style w:type="character" w:customStyle="1" w:styleId="YltunnisteChar">
+  <w:style w:type="character" w:styleId="YltunnisteChar" w:customStyle="1">
     <w:name w:val="Ylätunniste Char"/>
     <w:link w:val="Yltunniste"/>
     <w:uiPriority w:val="99"/>
@@ -16396,7 +16541,7 @@
       </w:tabs>
     </w:pPr>
   </w:style>
-  <w:style w:type="character" w:customStyle="1" w:styleId="AlatunnisteChar">
+  <w:style w:type="character" w:styleId="AlatunnisteChar" w:customStyle="1">
     <w:name w:val="Alatunniste Char"/>
     <w:link w:val="Alatunniste"/>
     <w:uiPriority w:val="99"/>
@@ -16579,7 +16724,7 @@
       <w:szCs w:val="22"/>
     </w:rPr>
   </w:style>
-  <w:style w:type="character" w:customStyle="1" w:styleId="Leipteksti2Char">
+  <w:style w:type="character" w:styleId="Leipteksti2Char" w:customStyle="1">
     <w:name w:val="Leipäteksti 2 Char"/>
     <w:link w:val="Leipteksti2"/>
     <w:uiPriority w:val="99"/>
@@ -16608,7 +16753,7 @@
       <w:szCs w:val="22"/>
     </w:rPr>
   </w:style>
-  <w:style w:type="character" w:customStyle="1" w:styleId="Sisennettyleipteksti2Char">
+  <w:style w:type="character" w:styleId="Sisennettyleipteksti2Char" w:customStyle="1">
     <w:name w:val="Sisennetty leipäteksti 2 Char"/>
     <w:link w:val="Sisennettyleipteksti2"/>
     <w:uiPriority w:val="99"/>
@@ -16635,7 +16780,7 @@
       <w:szCs w:val="20"/>
     </w:rPr>
   </w:style>
-  <w:style w:type="character" w:customStyle="1" w:styleId="Sisennettyleipteksti3Char">
+  <w:style w:type="character" w:styleId="Sisennettyleipteksti3Char" w:customStyle="1">
     <w:name w:val="Sisennetty leipäteksti 3 Char"/>
     <w:link w:val="Sisennettyleipteksti3"/>
     <w:uiPriority w:val="99"/>
@@ -16659,7 +16804,7 @@
       <w:szCs w:val="20"/>
     </w:rPr>
   </w:style>
-  <w:style w:type="character" w:customStyle="1" w:styleId="AlaviitteentekstiChar">
+  <w:style w:type="character" w:styleId="AlaviitteentekstiChar" w:customStyle="1">
     <w:name w:val="Alaviitteen teksti Char"/>
     <w:link w:val="Alaviitteenteksti"/>
     <w:uiPriority w:val="99"/>
@@ -16701,7 +16846,7 @@
       <w:szCs w:val="22"/>
     </w:rPr>
   </w:style>
-  <w:style w:type="character" w:customStyle="1" w:styleId="LeiptekstiChar">
+  <w:style w:type="character" w:styleId="LeiptekstiChar" w:customStyle="1">
     <w:name w:val="Leipäteksti Char"/>
     <w:link w:val="Leipteksti"/>
     <w:uiPriority w:val="99"/>
@@ -16725,7 +16870,7 @@
       <w:szCs w:val="20"/>
     </w:rPr>
   </w:style>
-  <w:style w:type="character" w:customStyle="1" w:styleId="Leipteksti3Char">
+  <w:style w:type="character" w:styleId="Leipteksti3Char" w:customStyle="1">
     <w:name w:val="Leipäteksti 3 Char"/>
     <w:link w:val="Leipteksti3"/>
     <w:uiPriority w:val="99"/>
@@ -16751,7 +16896,7 @@
       <w:rFonts w:ascii="Tahoma" w:hAnsi="Tahoma" w:cs="Tahoma"/>
     </w:rPr>
   </w:style>
-  <w:style w:type="character" w:customStyle="1" w:styleId="AsiakirjanrakenneruutuChar">
+  <w:style w:type="character" w:styleId="AsiakirjanrakenneruutuChar" w:customStyle="1">
     <w:name w:val="Asiakirjan rakenneruutu Char"/>
     <w:link w:val="Asiakirjanrakenneruutu"/>
     <w:uiPriority w:val="99"/>
@@ -16772,7 +16917,7 @@
       <w:spacing w:before="100" w:after="100"/>
     </w:pPr>
   </w:style>
-  <w:style w:type="paragraph" w:customStyle="1" w:styleId="RunkoTeksti">
+  <w:style w:type="paragraph" w:styleId="RunkoTeksti" w:customStyle="1">
     <w:name w:val="RunkoTeksti"/>
     <w:basedOn w:val="Normaali"/>
     <w:uiPriority w:val="99"/>
@@ -16787,7 +16932,7 @@
       <w:lang w:val="en-GB"/>
     </w:rPr>
   </w:style>
-  <w:style w:type="paragraph" w:customStyle="1" w:styleId="HeaderText">
+  <w:style w:type="paragraph" w:styleId="HeaderText" w:customStyle="1">
     <w:name w:val="Header Text"/>
     <w:basedOn w:val="Yltunniste"/>
     <w:next w:val="Yltunniste"/>
@@ -16810,7 +16955,7 @@
       <w:lang w:val="en-US"/>
     </w:rPr>
   </w:style>
-  <w:style w:type="paragraph" w:customStyle="1" w:styleId="HeaderText2">
+  <w:style w:type="paragraph" w:styleId="HeaderText2" w:customStyle="1">
     <w:name w:val="Header Text2"/>
     <w:basedOn w:val="Yltunniste"/>
     <w:uiPriority w:val="99"/>
@@ -16833,7 +16978,7 @@
       <w:lang w:val="en-US"/>
     </w:rPr>
   </w:style>
-  <w:style w:type="paragraph" w:customStyle="1" w:styleId="Taulukko">
+  <w:style w:type="paragraph" w:styleId="Taulukko" w:customStyle="1">
     <w:name w:val="Taulukko"/>
     <w:basedOn w:val="Normaali"/>
     <w:uiPriority w:val="99"/>
@@ -16854,7 +16999,7 @@
       <w:iCs/>
     </w:rPr>
   </w:style>
-  <w:style w:type="character" w:customStyle="1" w:styleId="CommentReference">
+  <w:style w:type="character" w:styleId="CommentReference" w:customStyle="1">
     <w:name w:val="Comment Reference"/>
     <w:uiPriority w:val="99"/>
     <w:semiHidden/>
@@ -16865,7 +17010,7 @@
       <w:szCs w:val="16"/>
     </w:rPr>
   </w:style>
-  <w:style w:type="paragraph" w:customStyle="1" w:styleId="CommentText">
+  <w:style w:type="paragraph" w:styleId="CommentText" w:customStyle="1">
     <w:name w:val="Comment Text"/>
     <w:basedOn w:val="Normaali"/>
     <w:link w:val="CommentTextChar"/>
@@ -16877,7 +17022,7 @@
       <w:szCs w:val="20"/>
     </w:rPr>
   </w:style>
-  <w:style w:type="character" w:customStyle="1" w:styleId="CommentTextChar">
+  <w:style w:type="character" w:styleId="CommentTextChar" w:customStyle="1">
     <w:name w:val="Comment Text Char"/>
     <w:link w:val="CommentText"/>
     <w:uiPriority w:val="99"/>
@@ -16890,7 +17035,7 @@
       <w:lang w:val="fi-FI" w:eastAsia="x-none"/>
     </w:rPr>
   </w:style>
-  <w:style w:type="paragraph" w:customStyle="1" w:styleId="CommentSubject">
+  <w:style w:type="paragraph" w:styleId="CommentSubject" w:customStyle="1">
     <w:name w:val="Comment Subject"/>
     <w:basedOn w:val="CommentText"/>
     <w:next w:val="CommentText"/>
@@ -16903,7 +17048,7 @@
       <w:bCs/>
     </w:rPr>
   </w:style>
-  <w:style w:type="character" w:customStyle="1" w:styleId="CommentSubjectChar">
+  <w:style w:type="character" w:styleId="CommentSubjectChar" w:customStyle="1">
     <w:name w:val="Comment Subject Char"/>
     <w:link w:val="CommentSubject"/>
     <w:uiPriority w:val="99"/>
@@ -16931,7 +17076,7 @@
       <w:szCs w:val="16"/>
     </w:rPr>
   </w:style>
-  <w:style w:type="character" w:customStyle="1" w:styleId="SelitetekstiChar">
+  <w:style w:type="character" w:styleId="SelitetekstiChar" w:customStyle="1">
     <w:name w:val="Seliteteksti Char"/>
     <w:link w:val="Seliteteksti"/>
     <w:uiPriority w:val="99"/>
@@ -16944,7 +17089,7 @@
       <w:lang w:val="fi-FI" w:eastAsia="x-none"/>
     </w:rPr>
   </w:style>
-  <w:style w:type="character" w:customStyle="1" w:styleId="spelle">
+  <w:style w:type="character" w:styleId="spelle" w:customStyle="1">
     <w:name w:val="spelle"/>
     <w:uiPriority w:val="99"/>
     <w:rsid w:val="00BF7A28"/>
@@ -16974,12 +17119,12 @@
     <w:rsid w:val="00A36F0B"/>
     <w:tblPr>
       <w:tblBorders>
-        <w:top w:val="single" w:sz="4" w:space="0" w:color="000000"/>
-        <w:left w:val="single" w:sz="4" w:space="0" w:color="000000"/>
-        <w:bottom w:val="single" w:sz="4" w:space="0" w:color="000000"/>
-        <w:right w:val="single" w:sz="4" w:space="0" w:color="000000"/>
-        <w:insideH w:val="single" w:sz="4" w:space="0" w:color="000000"/>
-        <w:insideV w:val="single" w:sz="4" w:space="0" w:color="000000"/>
+        <w:top w:val="single" w:color="000000" w:sz="4" w:space="0"/>
+        <w:left w:val="single" w:color="000000" w:sz="4" w:space="0"/>
+        <w:bottom w:val="single" w:color="000000" w:sz="4" w:space="0"/>
+        <w:right w:val="single" w:color="000000" w:sz="4" w:space="0"/>
+        <w:insideH w:val="single" w:color="000000" w:sz="4" w:space="0"/>
+        <w:insideV w:val="single" w:color="000000" w:sz="4" w:space="0"/>
       </w:tblBorders>
     </w:tblPr>
   </w:style>
@@ -17005,7 +17150,7 @@
       <w:shd w:val="clear" w:color="auto" w:fill="E1DFDD"/>
     </w:rPr>
   </w:style>
-  <w:style w:type="numbering" w:customStyle="1" w:styleId="CurrentList1">
+  <w:style w:type="numbering" w:styleId="CurrentList1" w:customStyle="1">
     <w:name w:val="Current List1"/>
     <w:uiPriority w:val="99"/>
     <w:rsid w:val="00EB7775"/>
@@ -17015,7 +17160,7 @@
       </w:numPr>
     </w:pPr>
   </w:style>
-  <w:style w:type="numbering" w:customStyle="1" w:styleId="CurrentList2">
+  <w:style w:type="numbering" w:styleId="CurrentList2" w:customStyle="1">
     <w:name w:val="Current List2"/>
     <w:uiPriority w:val="99"/>
     <w:rsid w:val="00EB7775"/>
@@ -17029,7 +17174,7 @@
 </file>
 
 <file path=word/theme/theme1.xml><?xml version="1.0" encoding="utf-8"?>
-<a:theme xmlns:a="http://schemas.openxmlformats.org/drawingml/2006/main" name="Office Theme">
+<a:theme xmlns:a="http://schemas.openxmlformats.org/drawingml/2006/main" xmlns:thm15="http://schemas.microsoft.com/office/thememl/2012/main" name="Office Theme">
   <a:themeElements>
     <a:clrScheme name="Office">
       <a:dk1>

</xml_diff>